<commit_message>
SSU promena lozinke i sign in
Change-Id: I3a81b72fef41e5255ba30e57bc299bfc5d5cd861
</commit_message>
<xml_diff>
--- a/SSU/Log_in.docx
+++ b/SSU/Log_in.docx
@@ -828,17 +828,8 @@
                 <w:rFonts w:ascii="Times New Roman" w:hAnsi="Times New Roman" w:cs="Times New Roman"/>
                 <w:szCs w:val="22"/>
               </w:rPr>
-              <w:t xml:space="preserve"> </w:t>
-            </w:r>
-            <w:proofErr w:type="spellStart"/>
-            <w:r>
-              <w:rPr>
-                <w:rFonts w:ascii="Times New Roman" w:hAnsi="Times New Roman" w:cs="Times New Roman"/>
-                <w:szCs w:val="22"/>
-              </w:rPr>
-              <w:t>zajedno</w:t>
-            </w:r>
-            <w:proofErr w:type="spellEnd"/>
+              <w:t xml:space="preserve"> zajedno</w:t>
+            </w:r>
           </w:p>
         </w:tc>
       </w:tr>
@@ -1189,7 +1180,7 @@
           <w:r>
             <w:fldChar w:fldCharType="separate"/>
           </w:r>
-          <w:hyperlink w:anchor="_Toc205762423" w:history="1">
+          <w:hyperlink w:anchor="_Toc205809929" w:history="1">
             <w:r>
               <w:rPr>
                 <w:rStyle w:val="Hyperlink"/>
@@ -1235,7 +1226,7 @@
                 <w:noProof/>
                 <w:webHidden/>
               </w:rPr>
-              <w:instrText xml:space="preserve"> PAGEREF _Toc205762423 \h </w:instrText>
+              <w:instrText xml:space="preserve"> PAGEREF _Toc205809929 \h </w:instrText>
             </w:r>
             <w:r>
               <w:rPr>
@@ -1280,7 +1271,7 @@
               <w:sz w:val="24"/>
             </w:rPr>
           </w:pPr>
-          <w:hyperlink w:anchor="_Toc205762424" w:history="1">
+          <w:hyperlink w:anchor="_Toc205809930" w:history="1">
             <w:r>
               <w:rPr>
                 <w:rStyle w:val="Hyperlink"/>
@@ -1326,7 +1317,7 @@
                 <w:noProof/>
                 <w:webHidden/>
               </w:rPr>
-              <w:instrText xml:space="preserve"> PAGEREF _Toc205762424 \h </w:instrText>
+              <w:instrText xml:space="preserve"> PAGEREF _Toc205809930 \h </w:instrText>
             </w:r>
             <w:r>
               <w:rPr>
@@ -1371,7 +1362,7 @@
               <w:sz w:val="24"/>
             </w:rPr>
           </w:pPr>
-          <w:hyperlink w:anchor="_Toc205762425" w:history="1">
+          <w:hyperlink w:anchor="_Toc205809931" w:history="1">
             <w:r>
               <w:rPr>
                 <w:rStyle w:val="Hyperlink"/>
@@ -1417,7 +1408,7 @@
                 <w:noProof/>
                 <w:webHidden/>
               </w:rPr>
-              <w:instrText xml:space="preserve"> PAGEREF _Toc205762425 \h </w:instrText>
+              <w:instrText xml:space="preserve"> PAGEREF _Toc205809931 \h </w:instrText>
             </w:r>
             <w:r>
               <w:rPr>
@@ -1461,7 +1452,7 @@
               <w:sz w:val="24"/>
             </w:rPr>
           </w:pPr>
-          <w:hyperlink w:anchor="_Toc205762426" w:history="1">
+          <w:hyperlink w:anchor="_Toc205809932" w:history="1">
             <w:r>
               <w:rPr>
                 <w:rStyle w:val="Hyperlink"/>
@@ -1488,7 +1479,7 @@
                 <w:noProof/>
                 <w:webHidden/>
               </w:rPr>
-              <w:instrText xml:space="preserve"> PAGEREF _Toc205762426 \h </w:instrText>
+              <w:instrText xml:space="preserve"> PAGEREF _Toc205809932 \h </w:instrText>
             </w:r>
             <w:r>
               <w:rPr>
@@ -1533,7 +1524,7 @@
               <w:sz w:val="24"/>
             </w:rPr>
           </w:pPr>
-          <w:hyperlink w:anchor="_Toc205762427" w:history="1">
+          <w:hyperlink w:anchor="_Toc205809933" w:history="1">
             <w:r>
               <w:rPr>
                 <w:rStyle w:val="Hyperlink"/>
@@ -1579,7 +1570,7 @@
                 <w:noProof/>
                 <w:webHidden/>
               </w:rPr>
-              <w:instrText xml:space="preserve"> PAGEREF _Toc205762427 \h </w:instrText>
+              <w:instrText xml:space="preserve"> PAGEREF _Toc205809933 \h </w:instrText>
             </w:r>
             <w:r>
               <w:rPr>
@@ -1624,7 +1615,7 @@
               <w:sz w:val="24"/>
             </w:rPr>
           </w:pPr>
-          <w:hyperlink w:anchor="_Toc205762428" w:history="1">
+          <w:hyperlink w:anchor="_Toc205809934" w:history="1">
             <w:r>
               <w:rPr>
                 <w:rStyle w:val="Hyperlink"/>
@@ -1670,7 +1661,7 @@
                 <w:noProof/>
                 <w:webHidden/>
               </w:rPr>
-              <w:instrText xml:space="preserve"> PAGEREF _Toc205762428 \h </w:instrText>
+              <w:instrText xml:space="preserve"> PAGEREF _Toc205809934 \h </w:instrText>
             </w:r>
             <w:r>
               <w:rPr>
@@ -1715,7 +1706,7 @@
               <w:sz w:val="24"/>
             </w:rPr>
           </w:pPr>
-          <w:hyperlink w:anchor="_Toc205762429" w:history="1">
+          <w:hyperlink w:anchor="_Toc205809935" w:history="1">
             <w:r>
               <w:rPr>
                 <w:rStyle w:val="Hyperlink"/>
@@ -1740,7 +1731,7 @@
                 <w:rFonts w:eastAsiaTheme="majorEastAsia"/>
                 <w:noProof/>
               </w:rPr>
-              <w:t>Scenario popunjavanja ankete</w:t>
+              <w:t>Scenario prijave na sistem</w:t>
             </w:r>
             <w:r>
               <w:rPr>
@@ -1761,7 +1752,7 @@
                 <w:noProof/>
                 <w:webHidden/>
               </w:rPr>
-              <w:instrText xml:space="preserve"> PAGEREF _Toc205762429 \h </w:instrText>
+              <w:instrText xml:space="preserve"> PAGEREF _Toc205809935 \h </w:instrText>
             </w:r>
             <w:r>
               <w:rPr>
@@ -1806,7 +1797,7 @@
               <w:sz w:val="24"/>
             </w:rPr>
           </w:pPr>
-          <w:hyperlink w:anchor="_Toc205762430" w:history="1">
+          <w:hyperlink w:anchor="_Toc205809936" w:history="1">
             <w:r>
               <w:rPr>
                 <w:rStyle w:val="Hyperlink"/>
@@ -1852,7 +1843,7 @@
                 <w:noProof/>
                 <w:webHidden/>
               </w:rPr>
-              <w:instrText xml:space="preserve"> PAGEREF _Toc205762430 \h </w:instrText>
+              <w:instrText xml:space="preserve"> PAGEREF _Toc205809936 \h </w:instrText>
             </w:r>
             <w:r>
               <w:rPr>
@@ -1897,7 +1888,7 @@
               <w:sz w:val="24"/>
             </w:rPr>
           </w:pPr>
-          <w:hyperlink w:anchor="_Toc205762431" w:history="1">
+          <w:hyperlink w:anchor="_Toc205809937" w:history="1">
             <w:r>
               <w:rPr>
                 <w:rStyle w:val="Hyperlink"/>
@@ -1943,7 +1934,7 @@
                 <w:noProof/>
                 <w:webHidden/>
               </w:rPr>
-              <w:instrText xml:space="preserve"> PAGEREF _Toc205762431 \h </w:instrText>
+              <w:instrText xml:space="preserve"> PAGEREF _Toc205809937 \h </w:instrText>
             </w:r>
             <w:r>
               <w:rPr>
@@ -1988,7 +1979,7 @@
               <w:sz w:val="24"/>
             </w:rPr>
           </w:pPr>
-          <w:hyperlink w:anchor="_Toc205762432" w:history="1">
+          <w:hyperlink w:anchor="_Toc205809938" w:history="1">
             <w:r>
               <w:rPr>
                 <w:rStyle w:val="Hyperlink"/>
@@ -2036,7 +2027,7 @@
                 <w:noProof/>
                 <w:webHidden/>
               </w:rPr>
-              <w:instrText xml:space="preserve"> PAGEREF _Toc205762432 \h </w:instrText>
+              <w:instrText xml:space="preserve"> PAGEREF _Toc205809938 \h </w:instrText>
             </w:r>
             <w:r>
               <w:rPr>
@@ -2081,7 +2072,7 @@
               <w:sz w:val="24"/>
             </w:rPr>
           </w:pPr>
-          <w:hyperlink w:anchor="_Toc205762433" w:history="1">
+          <w:hyperlink w:anchor="_Toc205809939" w:history="1">
             <w:r>
               <w:rPr>
                 <w:rStyle w:val="Hyperlink"/>
@@ -2130,7 +2121,7 @@
                 <w:noProof/>
                 <w:webHidden/>
               </w:rPr>
-              <w:instrText xml:space="preserve"> PAGEREF _Toc205762433 \h </w:instrText>
+              <w:instrText xml:space="preserve"> PAGEREF _Toc205809939 \h </w:instrText>
             </w:r>
             <w:r>
               <w:rPr>
@@ -2175,7 +2166,7 @@
               <w:sz w:val="24"/>
             </w:rPr>
           </w:pPr>
-          <w:hyperlink w:anchor="_Toc205762434" w:history="1">
+          <w:hyperlink w:anchor="_Toc205809940" w:history="1">
             <w:r>
               <w:rPr>
                 <w:rStyle w:val="Hyperlink"/>
@@ -2224,7 +2215,7 @@
                 <w:noProof/>
                 <w:webHidden/>
               </w:rPr>
-              <w:instrText xml:space="preserve"> PAGEREF _Toc205762434 \h </w:instrText>
+              <w:instrText xml:space="preserve"> PAGEREF _Toc205809940 \h </w:instrText>
             </w:r>
             <w:r>
               <w:rPr>
@@ -2269,7 +2260,7 @@
               <w:sz w:val="24"/>
             </w:rPr>
           </w:pPr>
-          <w:hyperlink w:anchor="_Toc205762435" w:history="1">
+          <w:hyperlink w:anchor="_Toc205809941" w:history="1">
             <w:r>
               <w:rPr>
                 <w:rStyle w:val="Hyperlink"/>
@@ -2317,7 +2308,7 @@
                 <w:noProof/>
                 <w:webHidden/>
               </w:rPr>
-              <w:instrText xml:space="preserve"> PAGEREF _Toc205762435 \h </w:instrText>
+              <w:instrText xml:space="preserve"> PAGEREF _Toc205809941 \h </w:instrText>
             </w:r>
             <w:r>
               <w:rPr>
@@ -2362,7 +2353,7 @@
               <w:sz w:val="24"/>
             </w:rPr>
           </w:pPr>
-          <w:hyperlink w:anchor="_Toc205762436" w:history="1">
+          <w:hyperlink w:anchor="_Toc205809942" w:history="1">
             <w:r>
               <w:rPr>
                 <w:rStyle w:val="Hyperlink"/>
@@ -2408,7 +2399,7 @@
                 <w:noProof/>
                 <w:webHidden/>
               </w:rPr>
-              <w:instrText xml:space="preserve"> PAGEREF _Toc205762436 \h </w:instrText>
+              <w:instrText xml:space="preserve"> PAGEREF _Toc205809942 \h </w:instrText>
             </w:r>
             <w:r>
               <w:rPr>
@@ -2453,7 +2444,7 @@
               <w:sz w:val="24"/>
             </w:rPr>
           </w:pPr>
-          <w:hyperlink w:anchor="_Toc205762437" w:history="1">
+          <w:hyperlink w:anchor="_Toc205809943" w:history="1">
             <w:r>
               <w:rPr>
                 <w:rStyle w:val="Hyperlink"/>
@@ -2499,7 +2490,7 @@
                 <w:noProof/>
                 <w:webHidden/>
               </w:rPr>
-              <w:instrText xml:space="preserve"> PAGEREF _Toc205762437 \h </w:instrText>
+              <w:instrText xml:space="preserve"> PAGEREF _Toc205809943 \h </w:instrText>
             </w:r>
             <w:r>
               <w:rPr>
@@ -2544,7 +2535,7 @@
               <w:sz w:val="24"/>
             </w:rPr>
           </w:pPr>
-          <w:hyperlink w:anchor="_Toc205762438" w:history="1">
+          <w:hyperlink w:anchor="_Toc205809944" w:history="1">
             <w:r>
               <w:rPr>
                 <w:rStyle w:val="Hyperlink"/>
@@ -2590,7 +2581,7 @@
                 <w:noProof/>
                 <w:webHidden/>
               </w:rPr>
-              <w:instrText xml:space="preserve"> PAGEREF _Toc205762438 \h </w:instrText>
+              <w:instrText xml:space="preserve"> PAGEREF _Toc205809944 \h </w:instrText>
             </w:r>
             <w:r>
               <w:rPr>
@@ -2657,7 +2648,7 @@
         <w:spacing w:after="63"/>
         <w:ind w:left="705" w:hanging="720"/>
       </w:pPr>
-      <w:bookmarkStart w:id="0" w:name="_Toc205762423"/>
+      <w:bookmarkStart w:id="0" w:name="_Toc205809929"/>
       <w:proofErr w:type="spellStart"/>
       <w:r>
         <w:t>Uvod</w:t>
@@ -2673,7 +2664,7 @@
         <w:pStyle w:val="Heading2"/>
         <w:ind w:left="705" w:hanging="720"/>
       </w:pPr>
-      <w:bookmarkStart w:id="1" w:name="_Toc205762424"/>
+      <w:bookmarkStart w:id="1" w:name="_Toc205809930"/>
       <w:proofErr w:type="spellStart"/>
       <w:r>
         <w:t>Rezime</w:t>
@@ -2950,7 +2941,7 @@
         <w:spacing w:after="83"/>
         <w:ind w:left="705" w:hanging="720"/>
       </w:pPr>
-      <w:bookmarkStart w:id="2" w:name="_Toc205762425"/>
+      <w:bookmarkStart w:id="2" w:name="_Toc205809931"/>
       <w:proofErr w:type="spellStart"/>
       <w:r>
         <w:t>Namena</w:t>
@@ -3002,7 +2993,7 @@
         </w:numPr>
         <w:ind w:left="705"/>
       </w:pPr>
-      <w:bookmarkStart w:id="3" w:name="_Toc205762426"/>
+      <w:bookmarkStart w:id="3" w:name="_Toc205809932"/>
       <w:proofErr w:type="spellStart"/>
       <w:r>
         <w:rPr>
@@ -3314,7 +3305,7 @@
         <w:pStyle w:val="Heading2"/>
         <w:ind w:left="705" w:hanging="720"/>
       </w:pPr>
-      <w:bookmarkStart w:id="4" w:name="_Toc205762427"/>
+      <w:bookmarkStart w:id="4" w:name="_Toc205809933"/>
       <w:r>
         <w:t>Reference</w:t>
       </w:r>
@@ -3511,7 +3502,7 @@
         <w:spacing w:after="0"/>
         <w:ind w:left="705" w:hanging="720"/>
       </w:pPr>
-      <w:bookmarkStart w:id="5" w:name="_Toc205762428"/>
+      <w:bookmarkStart w:id="5" w:name="_Toc205809934"/>
       <w:r>
         <w:t xml:space="preserve">Otvorena </w:t>
       </w:r>
@@ -4413,21 +4404,29 @@
         <w:pStyle w:val="Heading1"/>
         <w:ind w:left="705" w:hanging="720"/>
       </w:pPr>
-      <w:bookmarkStart w:id="6" w:name="_Toc205762429"/>
+      <w:bookmarkStart w:id="6" w:name="_Toc205809935"/>
       <w:r>
         <w:t xml:space="preserve">Scenario </w:t>
       </w:r>
       <w:proofErr w:type="spellStart"/>
       <w:r>
-        <w:t>popunjavanja</w:t>
-      </w:r>
-      <w:proofErr w:type="spellEnd"/>
-      <w:r>
-        <w:t xml:space="preserve"> </w:t>
-      </w:r>
-      <w:proofErr w:type="spellStart"/>
-      <w:r>
-        <w:t>ankete</w:t>
+        <w:t>prijave</w:t>
+      </w:r>
+      <w:proofErr w:type="spellEnd"/>
+      <w:r>
+        <w:t xml:space="preserve"> </w:t>
+      </w:r>
+      <w:proofErr w:type="spellStart"/>
+      <w:r>
+        <w:t>na</w:t>
+      </w:r>
+      <w:proofErr w:type="spellEnd"/>
+      <w:r>
+        <w:t xml:space="preserve"> </w:t>
+      </w:r>
+      <w:proofErr w:type="spellStart"/>
+      <w:r>
+        <w:t>sistem</w:t>
       </w:r>
       <w:bookmarkEnd w:id="6"/>
       <w:proofErr w:type="spellEnd"/>
@@ -4453,7 +4452,7 @@
         <w:spacing w:after="57"/>
         <w:ind w:left="705" w:hanging="720"/>
       </w:pPr>
-      <w:bookmarkStart w:id="7" w:name="_Toc205762430"/>
+      <w:bookmarkStart w:id="7" w:name="_Toc205809936"/>
       <w:proofErr w:type="spellStart"/>
       <w:r>
         <w:rPr>
@@ -5150,7 +5149,7 @@
         <w:spacing w:after="57"/>
         <w:ind w:left="705" w:hanging="720"/>
       </w:pPr>
-      <w:bookmarkStart w:id="8" w:name="_Toc205762431"/>
+      <w:bookmarkStart w:id="8" w:name="_Toc205809937"/>
       <w:r>
         <w:rPr>
           <w:u w:val="single" w:color="000000"/>
@@ -5176,7 +5175,7 @@
         <w:spacing w:after="56"/>
         <w:ind w:left="720" w:hanging="720"/>
       </w:pPr>
-      <w:bookmarkStart w:id="9" w:name="_Toc205762432"/>
+      <w:bookmarkStart w:id="9" w:name="_Toc205809938"/>
       <w:proofErr w:type="spellStart"/>
       <w:r>
         <w:rPr>
@@ -6060,7 +6059,7 @@
           <w:iCs/>
         </w:rPr>
       </w:pPr>
-      <w:bookmarkStart w:id="10" w:name="_Toc205762433"/>
+      <w:bookmarkStart w:id="10" w:name="_Toc205809939"/>
       <w:proofErr w:type="spellStart"/>
       <w:r>
         <w:rPr>
@@ -6630,7 +6629,7 @@
           <w:iCs/>
         </w:rPr>
       </w:pPr>
-      <w:bookmarkStart w:id="11" w:name="_Toc205762434"/>
+      <w:bookmarkStart w:id="11" w:name="_Toc205809940"/>
       <w:proofErr w:type="spellStart"/>
       <w:r>
         <w:rPr>
@@ -7096,7 +7095,7 @@
         <w:spacing w:after="60"/>
         <w:ind w:left="720" w:hanging="720"/>
       </w:pPr>
-      <w:bookmarkStart w:id="12" w:name="_Toc205762435"/>
+      <w:bookmarkStart w:id="12" w:name="_Toc205809941"/>
       <w:proofErr w:type="spellStart"/>
       <w:r>
         <w:rPr>
@@ -7641,7 +7640,7 @@
         <w:spacing w:after="220"/>
         <w:ind w:left="705" w:hanging="720"/>
       </w:pPr>
-      <w:bookmarkStart w:id="13" w:name="_Toc205762436"/>
+      <w:bookmarkStart w:id="13" w:name="_Toc205809942"/>
       <w:proofErr w:type="spellStart"/>
       <w:r>
         <w:t>Posebni</w:t>
@@ -7936,7 +7935,7 @@
         <w:spacing w:after="195"/>
         <w:ind w:left="705" w:hanging="720"/>
       </w:pPr>
-      <w:bookmarkStart w:id="14" w:name="_Toc205762437"/>
+      <w:bookmarkStart w:id="14" w:name="_Toc205809943"/>
       <w:proofErr w:type="spellStart"/>
       <w:r>
         <w:t>Preduslovi</w:t>
@@ -8280,7 +8279,7 @@
         <w:spacing w:after="90"/>
         <w:ind w:left="705" w:hanging="720"/>
       </w:pPr>
-      <w:bookmarkStart w:id="15" w:name="_Toc205762438"/>
+      <w:bookmarkStart w:id="15" w:name="_Toc205809944"/>
       <w:proofErr w:type="spellStart"/>
       <w:r>
         <w:t>Posledice</w:t>
@@ -8310,15 +8309,15 @@
           <w:rFonts w:ascii="Times New Roman" w:eastAsia="Times New Roman" w:hAnsi="Times New Roman" w:cs="Times New Roman"/>
           <w:sz w:val="20"/>
         </w:rPr>
-        <w:t>U sl</w:t>
-      </w:r>
-      <w:proofErr w:type="spellStart"/>
-      <w:r>
-        <w:rPr>
-          <w:rFonts w:ascii="Times New Roman" w:eastAsia="Times New Roman" w:hAnsi="Times New Roman" w:cs="Times New Roman"/>
-          <w:sz w:val="20"/>
-        </w:rPr>
-        <w:t>učaju</w:t>
+        <w:t xml:space="preserve">U </w:t>
+      </w:r>
+      <w:proofErr w:type="spellStart"/>
+      <w:r>
+        <w:rPr>
+          <w:rFonts w:ascii="Times New Roman" w:eastAsia="Times New Roman" w:hAnsi="Times New Roman" w:cs="Times New Roman"/>
+          <w:sz w:val="20"/>
+        </w:rPr>
+        <w:t>slučaju</w:t>
       </w:r>
       <w:proofErr w:type="spellEnd"/>
       <w:r>
@@ -8508,7 +8507,23 @@
           <w:rFonts w:ascii="Times New Roman" w:eastAsia="Times New Roman" w:hAnsi="Times New Roman" w:cs="Times New Roman"/>
           <w:sz w:val="20"/>
         </w:rPr>
-        <w:t xml:space="preserve">U slučaju </w:t>
+        <w:t xml:space="preserve">U </w:t>
+      </w:r>
+      <w:proofErr w:type="spellStart"/>
+      <w:r>
+        <w:rPr>
+          <w:rFonts w:ascii="Times New Roman" w:eastAsia="Times New Roman" w:hAnsi="Times New Roman" w:cs="Times New Roman"/>
+          <w:sz w:val="20"/>
+        </w:rPr>
+        <w:t>slučaju</w:t>
+      </w:r>
+      <w:proofErr w:type="spellEnd"/>
+      <w:r>
+        <w:rPr>
+          <w:rFonts w:ascii="Times New Roman" w:eastAsia="Times New Roman" w:hAnsi="Times New Roman" w:cs="Times New Roman"/>
+          <w:sz w:val="20"/>
+        </w:rPr>
+        <w:t xml:space="preserve"> </w:t>
       </w:r>
       <w:proofErr w:type="spellStart"/>
       <w:r>
@@ -11692,6 +11707,7 @@
   <w:style w:type="character" w:default="1" w:styleId="DefaultParagraphFont">
     <w:name w:val="Default Paragraph Font"/>
     <w:uiPriority w:val="1"/>
+    <w:semiHidden/>
     <w:unhideWhenUsed/>
   </w:style>
   <w:style w:type="table" w:default="1" w:styleId="TableNormal">

</xml_diff>

<commit_message>
SSU sign up i promena lozinke sa malim izmenama
Change-Id: I997ef1ffa3d5534bef5c316e3631bed3ccef1b27
</commit_message>
<xml_diff>
--- a/SSU/Log_in.docx
+++ b/SSU/Log_in.docx
@@ -466,12 +466,6 @@
       <w:pPr>
         <w:pStyle w:val="Heading1"/>
         <w:sectPr>
-          <w:headerReference w:type="even" r:id="rId7"/>
-          <w:headerReference w:type="default" r:id="rId8"/>
-          <w:footerReference w:type="even" r:id="rId9"/>
-          <w:footerReference w:type="default" r:id="rId10"/>
-          <w:headerReference w:type="first" r:id="rId11"/>
-          <w:footerReference w:type="first" r:id="rId12"/>
           <w:pgSz w:w="11906" w:h="16838"/>
           <w:pgMar w:top="1440" w:right="1832" w:bottom="1440" w:left="1419" w:header="720" w:footer="720" w:gutter="0"/>
           <w:cols w:space="720"/>
@@ -807,28 +801,69 @@
                 <w:szCs w:val="22"/>
               </w:rPr>
             </w:pPr>
+            <w:proofErr w:type="spellStart"/>
             <w:r>
               <w:rPr>
                 <w:rFonts w:ascii="Times New Roman" w:hAnsi="Times New Roman" w:cs="Times New Roman"/>
                 <w:szCs w:val="22"/>
               </w:rPr>
-              <w:t xml:space="preserve">Ceo </w:t>
-            </w:r>
-            <w:proofErr w:type="spellStart"/>
+              <w:t>RealArt</w:t>
+            </w:r>
+            <w:proofErr w:type="spellEnd"/>
             <w:r>
               <w:rPr>
                 <w:rFonts w:ascii="Times New Roman" w:hAnsi="Times New Roman" w:cs="Times New Roman"/>
                 <w:szCs w:val="22"/>
               </w:rPr>
-              <w:t>tim</w:t>
-            </w:r>
-            <w:proofErr w:type="spellEnd"/>
+              <w:t xml:space="preserve"> – </w:t>
+            </w:r>
+            <w:proofErr w:type="spellStart"/>
             <w:r>
               <w:rPr>
                 <w:rFonts w:ascii="Times New Roman" w:hAnsi="Times New Roman" w:cs="Times New Roman"/>
                 <w:szCs w:val="22"/>
               </w:rPr>
-              <w:t xml:space="preserve"> zajedno</w:t>
+              <w:t>zajedno</w:t>
+            </w:r>
+            <w:proofErr w:type="spellEnd"/>
+            <w:r>
+              <w:rPr>
+                <w:rFonts w:ascii="Times New Roman" w:hAnsi="Times New Roman" w:cs="Times New Roman"/>
+                <w:szCs w:val="22"/>
+              </w:rPr>
+              <w:t xml:space="preserve"> </w:t>
+            </w:r>
+            <w:proofErr w:type="spellStart"/>
+            <w:r>
+              <w:rPr>
+                <w:rFonts w:ascii="Times New Roman" w:hAnsi="Times New Roman" w:cs="Times New Roman"/>
+                <w:szCs w:val="22"/>
+              </w:rPr>
+              <w:t>uradjen</w:t>
+            </w:r>
+            <w:proofErr w:type="spellEnd"/>
+            <w:r>
+              <w:rPr>
+                <w:rFonts w:ascii="Times New Roman" w:hAnsi="Times New Roman" w:cs="Times New Roman"/>
+                <w:szCs w:val="22"/>
+              </w:rPr>
+              <w:t xml:space="preserve"> </w:t>
+            </w:r>
+            <w:proofErr w:type="spellStart"/>
+            <w:r>
+              <w:rPr>
+                <w:rFonts w:ascii="Times New Roman" w:hAnsi="Times New Roman" w:cs="Times New Roman"/>
+                <w:szCs w:val="22"/>
+              </w:rPr>
+              <w:t>prvi</w:t>
+            </w:r>
+            <w:proofErr w:type="spellEnd"/>
+            <w:r>
+              <w:rPr>
+                <w:rFonts w:ascii="Times New Roman" w:hAnsi="Times New Roman" w:cs="Times New Roman"/>
+                <w:szCs w:val="22"/>
+              </w:rPr>
+              <w:t xml:space="preserve"> SSU</w:t>
             </w:r>
           </w:p>
         </w:tc>
@@ -6057,6 +6092,7 @@
         <w:rPr>
           <w:i/>
           <w:iCs/>
+          <w:u w:val="none"/>
         </w:rPr>
       </w:pPr>
       <w:bookmarkStart w:id="10" w:name="_Toc205809939"/>
@@ -6065,6 +6101,7 @@
         <w:rPr>
           <w:i/>
           <w:iCs/>
+          <w:u w:val="none"/>
         </w:rPr>
         <w:t>Korisnik</w:t>
       </w:r>
@@ -6073,6 +6110,7 @@
         <w:rPr>
           <w:i/>
           <w:iCs/>
+          <w:u w:val="none"/>
         </w:rPr>
         <w:t xml:space="preserve"> </w:t>
       </w:r>
@@ -6081,6 +6119,7 @@
         <w:rPr>
           <w:i/>
           <w:iCs/>
+          <w:u w:val="none"/>
         </w:rPr>
         <w:t>unosi</w:t>
       </w:r>
@@ -6089,6 +6128,7 @@
         <w:rPr>
           <w:i/>
           <w:iCs/>
+          <w:u w:val="none"/>
         </w:rPr>
         <w:t xml:space="preserve"> </w:t>
       </w:r>
@@ -6097,6 +6137,7 @@
         <w:rPr>
           <w:i/>
           <w:iCs/>
+          <w:u w:val="none"/>
         </w:rPr>
         <w:t>pogrešnu</w:t>
       </w:r>
@@ -6105,6 +6146,7 @@
         <w:rPr>
           <w:i/>
           <w:iCs/>
+          <w:u w:val="none"/>
         </w:rPr>
         <w:t xml:space="preserve"> </w:t>
       </w:r>
@@ -6113,6 +6155,7 @@
         <w:rPr>
           <w:i/>
           <w:iCs/>
+          <w:u w:val="none"/>
         </w:rPr>
         <w:t>lozinku</w:t>
       </w:r>
@@ -6122,6 +6165,7 @@
         <w:rPr>
           <w:i/>
           <w:iCs/>
+          <w:u w:val="none"/>
         </w:rPr>
         <w:t xml:space="preserve">  </w:t>
       </w:r>
@@ -6627,6 +6671,7 @@
         <w:rPr>
           <w:i/>
           <w:iCs/>
+          <w:u w:val="none"/>
         </w:rPr>
       </w:pPr>
       <w:bookmarkStart w:id="11" w:name="_Toc205809940"/>
@@ -6635,6 +6680,7 @@
         <w:rPr>
           <w:i/>
           <w:iCs/>
+          <w:u w:val="none"/>
         </w:rPr>
         <w:t>Korisnik</w:t>
       </w:r>
@@ -6643,6 +6689,7 @@
         <w:rPr>
           <w:i/>
           <w:iCs/>
+          <w:u w:val="none"/>
         </w:rPr>
         <w:t xml:space="preserve"> </w:t>
       </w:r>
@@ -6651,6 +6698,7 @@
         <w:rPr>
           <w:i/>
           <w:iCs/>
+          <w:u w:val="none"/>
         </w:rPr>
         <w:t>unosi</w:t>
       </w:r>
@@ -6659,6 +6707,7 @@
         <w:rPr>
           <w:i/>
           <w:iCs/>
+          <w:u w:val="none"/>
         </w:rPr>
         <w:t xml:space="preserve"> </w:t>
       </w:r>
@@ -6667,6 +6716,7 @@
         <w:rPr>
           <w:i/>
           <w:iCs/>
+          <w:u w:val="none"/>
         </w:rPr>
         <w:t>nepostojeće</w:t>
       </w:r>
@@ -6675,6 +6725,7 @@
         <w:rPr>
           <w:i/>
           <w:iCs/>
+          <w:u w:val="none"/>
         </w:rPr>
         <w:t xml:space="preserve"> </w:t>
       </w:r>
@@ -6683,6 +6734,7 @@
         <w:rPr>
           <w:i/>
           <w:iCs/>
+          <w:u w:val="none"/>
         </w:rPr>
         <w:t>korisničko</w:t>
       </w:r>
@@ -6691,6 +6743,7 @@
         <w:rPr>
           <w:i/>
           <w:iCs/>
+          <w:u w:val="none"/>
         </w:rPr>
         <w:t xml:space="preserve"> </w:t>
       </w:r>
@@ -6699,6 +6752,7 @@
         <w:rPr>
           <w:i/>
           <w:iCs/>
+          <w:u w:val="none"/>
         </w:rPr>
         <w:t>ime</w:t>
       </w:r>
@@ -7616,47 +7670,208 @@
     </w:p>
     <w:p>
       <w:pPr>
+        <w:spacing w:after="113"/>
+      </w:pPr>
+    </w:p>
+    <w:p>
+      <w:pPr>
+        <w:pStyle w:val="Heading2"/>
+        <w:spacing w:after="220"/>
+        <w:ind w:left="705" w:hanging="720"/>
+      </w:pPr>
+      <w:bookmarkStart w:id="13" w:name="_Toc205809942"/>
+      <w:proofErr w:type="spellStart"/>
+      <w:r>
+        <w:t>Posebni</w:t>
+      </w:r>
+      <w:proofErr w:type="spellEnd"/>
+      <w:r>
+        <w:t xml:space="preserve"> </w:t>
+      </w:r>
+      <w:proofErr w:type="spellStart"/>
+      <w:r>
+        <w:t>zahtevi</w:t>
+      </w:r>
+      <w:bookmarkEnd w:id="13"/>
+      <w:proofErr w:type="spellEnd"/>
+      <w:r>
+        <w:t xml:space="preserve"> </w:t>
+      </w:r>
+    </w:p>
+    <w:p>
+      <w:pPr>
         <w:pStyle w:val="ListParagraph"/>
         <w:numPr>
           <w:ilvl w:val="0"/>
-          <w:numId w:val="8"/>
+          <w:numId w:val="14"/>
         </w:numPr>
-        <w:spacing w:after="3" w:line="252" w:lineRule="auto"/>
-        <w:ind w:right="1291"/>
-        <w:rPr>
-          <w:rFonts w:ascii="Times New Roman" w:eastAsia="Times New Roman" w:hAnsi="Times New Roman" w:cs="Times New Roman"/>
-          <w:sz w:val="20"/>
-        </w:rPr>
-      </w:pPr>
-    </w:p>
-    <w:p>
-      <w:pPr>
-        <w:spacing w:after="113"/>
-      </w:pPr>
-    </w:p>
-    <w:p>
-      <w:pPr>
-        <w:pStyle w:val="Heading2"/>
-        <w:spacing w:after="220"/>
-        <w:ind w:left="705" w:hanging="720"/>
-      </w:pPr>
-      <w:bookmarkStart w:id="13" w:name="_Toc205809942"/>
-      <w:proofErr w:type="spellStart"/>
-      <w:r>
-        <w:t>Posebni</w:t>
-      </w:r>
-      <w:proofErr w:type="spellEnd"/>
-      <w:r>
-        <w:t xml:space="preserve"> </w:t>
-      </w:r>
-      <w:proofErr w:type="spellStart"/>
-      <w:r>
-        <w:t>zahtevi</w:t>
-      </w:r>
-      <w:bookmarkEnd w:id="13"/>
-      <w:proofErr w:type="spellEnd"/>
-      <w:r>
-        <w:t xml:space="preserve"> </w:t>
+        <w:rPr>
+          <w:rFonts w:ascii="Times New Roman" w:hAnsi="Times New Roman" w:cs="Times New Roman"/>
+          <w:sz w:val="20"/>
+          <w:szCs w:val="22"/>
+        </w:rPr>
+      </w:pPr>
+      <w:proofErr w:type="spellStart"/>
+      <w:r>
+        <w:rPr>
+          <w:rFonts w:ascii="Times New Roman" w:hAnsi="Times New Roman" w:cs="Times New Roman"/>
+          <w:sz w:val="20"/>
+          <w:szCs w:val="22"/>
+        </w:rPr>
+        <w:t>Proces</w:t>
+      </w:r>
+      <w:proofErr w:type="spellEnd"/>
+      <w:r>
+        <w:rPr>
+          <w:rFonts w:ascii="Times New Roman" w:hAnsi="Times New Roman" w:cs="Times New Roman"/>
+          <w:sz w:val="20"/>
+          <w:szCs w:val="22"/>
+        </w:rPr>
+        <w:t xml:space="preserve"> </w:t>
+      </w:r>
+      <w:proofErr w:type="spellStart"/>
+      <w:r>
+        <w:rPr>
+          <w:rFonts w:ascii="Times New Roman" w:hAnsi="Times New Roman" w:cs="Times New Roman"/>
+          <w:sz w:val="20"/>
+          <w:szCs w:val="22"/>
+        </w:rPr>
+        <w:t>prijave</w:t>
+      </w:r>
+      <w:proofErr w:type="spellEnd"/>
+      <w:r>
+        <w:rPr>
+          <w:rFonts w:ascii="Times New Roman" w:hAnsi="Times New Roman" w:cs="Times New Roman"/>
+          <w:sz w:val="20"/>
+          <w:szCs w:val="22"/>
+        </w:rPr>
+        <w:t xml:space="preserve"> mora </w:t>
+      </w:r>
+      <w:proofErr w:type="spellStart"/>
+      <w:r>
+        <w:rPr>
+          <w:rFonts w:ascii="Times New Roman" w:hAnsi="Times New Roman" w:cs="Times New Roman"/>
+          <w:sz w:val="20"/>
+          <w:szCs w:val="22"/>
+        </w:rPr>
+        <w:t>biti</w:t>
+      </w:r>
+      <w:proofErr w:type="spellEnd"/>
+      <w:r>
+        <w:rPr>
+          <w:rFonts w:ascii="Times New Roman" w:hAnsi="Times New Roman" w:cs="Times New Roman"/>
+          <w:sz w:val="20"/>
+          <w:szCs w:val="22"/>
+        </w:rPr>
+        <w:t xml:space="preserve"> </w:t>
+      </w:r>
+      <w:proofErr w:type="spellStart"/>
+      <w:r>
+        <w:rPr>
+          <w:rFonts w:ascii="Times New Roman" w:hAnsi="Times New Roman" w:cs="Times New Roman"/>
+          <w:sz w:val="20"/>
+          <w:szCs w:val="22"/>
+        </w:rPr>
+        <w:t>završen</w:t>
+      </w:r>
+      <w:proofErr w:type="spellEnd"/>
+      <w:r>
+        <w:rPr>
+          <w:rFonts w:ascii="Times New Roman" w:hAnsi="Times New Roman" w:cs="Times New Roman"/>
+          <w:sz w:val="20"/>
+          <w:szCs w:val="22"/>
+        </w:rPr>
+        <w:t xml:space="preserve"> za </w:t>
+      </w:r>
+      <w:proofErr w:type="spellStart"/>
+      <w:r>
+        <w:rPr>
+          <w:rFonts w:ascii="Times New Roman" w:hAnsi="Times New Roman" w:cs="Times New Roman"/>
+          <w:sz w:val="20"/>
+          <w:szCs w:val="22"/>
+        </w:rPr>
+        <w:t>manje</w:t>
+      </w:r>
+      <w:proofErr w:type="spellEnd"/>
+      <w:r>
+        <w:rPr>
+          <w:rFonts w:ascii="Times New Roman" w:hAnsi="Times New Roman" w:cs="Times New Roman"/>
+          <w:sz w:val="20"/>
+          <w:szCs w:val="22"/>
+        </w:rPr>
+        <w:t xml:space="preserve"> od 2 </w:t>
+      </w:r>
+      <w:proofErr w:type="spellStart"/>
+      <w:r>
+        <w:rPr>
+          <w:rFonts w:ascii="Times New Roman" w:hAnsi="Times New Roman" w:cs="Times New Roman"/>
+          <w:sz w:val="20"/>
+          <w:szCs w:val="22"/>
+        </w:rPr>
+        <w:t>sekunde</w:t>
+      </w:r>
+      <w:proofErr w:type="spellEnd"/>
+      <w:r>
+        <w:rPr>
+          <w:rFonts w:ascii="Times New Roman" w:hAnsi="Times New Roman" w:cs="Times New Roman"/>
+          <w:sz w:val="20"/>
+          <w:szCs w:val="22"/>
+        </w:rPr>
+        <w:t xml:space="preserve"> </w:t>
+      </w:r>
+      <w:proofErr w:type="spellStart"/>
+      <w:r>
+        <w:rPr>
+          <w:rFonts w:ascii="Times New Roman" w:hAnsi="Times New Roman" w:cs="Times New Roman"/>
+          <w:sz w:val="20"/>
+          <w:szCs w:val="22"/>
+        </w:rPr>
+        <w:t>pri</w:t>
+      </w:r>
+      <w:proofErr w:type="spellEnd"/>
+      <w:r>
+        <w:rPr>
+          <w:rFonts w:ascii="Times New Roman" w:hAnsi="Times New Roman" w:cs="Times New Roman"/>
+          <w:sz w:val="20"/>
+          <w:szCs w:val="22"/>
+        </w:rPr>
+        <w:t xml:space="preserve"> </w:t>
+      </w:r>
+      <w:proofErr w:type="spellStart"/>
+      <w:r>
+        <w:rPr>
+          <w:rFonts w:ascii="Times New Roman" w:hAnsi="Times New Roman" w:cs="Times New Roman"/>
+          <w:sz w:val="20"/>
+          <w:szCs w:val="22"/>
+        </w:rPr>
+        <w:t>normalnom</w:t>
+      </w:r>
+      <w:proofErr w:type="spellEnd"/>
+      <w:r>
+        <w:rPr>
+          <w:rFonts w:ascii="Times New Roman" w:hAnsi="Times New Roman" w:cs="Times New Roman"/>
+          <w:sz w:val="20"/>
+          <w:szCs w:val="22"/>
+        </w:rPr>
+        <w:t xml:space="preserve"> </w:t>
+      </w:r>
+      <w:proofErr w:type="spellStart"/>
+      <w:r>
+        <w:rPr>
+          <w:rFonts w:ascii="Times New Roman" w:hAnsi="Times New Roman" w:cs="Times New Roman"/>
+          <w:sz w:val="20"/>
+          <w:szCs w:val="22"/>
+        </w:rPr>
+        <w:t>opterećenju</w:t>
+      </w:r>
+      <w:proofErr w:type="spellEnd"/>
+      <w:r>
+        <w:rPr>
+          <w:rFonts w:ascii="Times New Roman" w:hAnsi="Times New Roman" w:cs="Times New Roman"/>
+          <w:sz w:val="20"/>
+          <w:szCs w:val="22"/>
+        </w:rPr>
+        <w:t>.</w:t>
       </w:r>
     </w:p>
     <w:p>
@@ -7664,158 +7879,138 @@
         <w:pStyle w:val="ListParagraph"/>
         <w:numPr>
           <w:ilvl w:val="0"/>
-          <w:numId w:val="12"/>
+          <w:numId w:val="14"/>
         </w:numPr>
-        <w:spacing w:after="0" w:line="319" w:lineRule="auto"/>
-        <w:ind w:right="4087"/>
-        <w:rPr>
-          <w:rFonts w:ascii="Times New Roman" w:eastAsia="Times New Roman" w:hAnsi="Times New Roman" w:cs="Times New Roman"/>
-          <w:sz w:val="20"/>
-        </w:rPr>
-      </w:pPr>
-      <w:proofErr w:type="spellStart"/>
-      <w:r>
-        <w:rPr>
-          <w:rFonts w:ascii="Times New Roman" w:eastAsia="Times New Roman" w:hAnsi="Times New Roman" w:cs="Times New Roman"/>
-          <w:sz w:val="20"/>
-        </w:rPr>
-        <w:t>Proces</w:t>
-      </w:r>
-      <w:proofErr w:type="spellEnd"/>
-      <w:r>
-        <w:rPr>
-          <w:rFonts w:ascii="Times New Roman" w:eastAsia="Times New Roman" w:hAnsi="Times New Roman" w:cs="Times New Roman"/>
-          <w:sz w:val="20"/>
-        </w:rPr>
-        <w:t xml:space="preserve"> </w:t>
-      </w:r>
-      <w:proofErr w:type="spellStart"/>
-      <w:r>
-        <w:rPr>
-          <w:rFonts w:ascii="Times New Roman" w:eastAsia="Times New Roman" w:hAnsi="Times New Roman" w:cs="Times New Roman"/>
-          <w:sz w:val="20"/>
-        </w:rPr>
-        <w:t>prijave</w:t>
-      </w:r>
-      <w:proofErr w:type="spellEnd"/>
-      <w:r>
-        <w:rPr>
-          <w:rFonts w:ascii="Times New Roman" w:eastAsia="Times New Roman" w:hAnsi="Times New Roman" w:cs="Times New Roman"/>
-          <w:sz w:val="20"/>
+        <w:rPr>
+          <w:rFonts w:ascii="Times New Roman" w:hAnsi="Times New Roman" w:cs="Times New Roman"/>
+          <w:sz w:val="20"/>
+          <w:szCs w:val="22"/>
+        </w:rPr>
+      </w:pPr>
+      <w:proofErr w:type="spellStart"/>
+      <w:r>
+        <w:rPr>
+          <w:rFonts w:ascii="Times New Roman" w:hAnsi="Times New Roman" w:cs="Times New Roman"/>
+          <w:sz w:val="20"/>
+          <w:szCs w:val="22"/>
+        </w:rPr>
+        <w:t>Sistem</w:t>
+      </w:r>
+      <w:proofErr w:type="spellEnd"/>
+      <w:r>
+        <w:rPr>
+          <w:rFonts w:ascii="Times New Roman" w:hAnsi="Times New Roman" w:cs="Times New Roman"/>
+          <w:sz w:val="20"/>
+          <w:szCs w:val="22"/>
         </w:rPr>
         <w:t xml:space="preserve"> mora </w:t>
       </w:r>
       <w:proofErr w:type="spellStart"/>
       <w:r>
         <w:rPr>
-          <w:rFonts w:ascii="Times New Roman" w:eastAsia="Times New Roman" w:hAnsi="Times New Roman" w:cs="Times New Roman"/>
-          <w:sz w:val="20"/>
-        </w:rPr>
-        <w:t>biti</w:t>
-      </w:r>
-      <w:proofErr w:type="spellEnd"/>
-      <w:r>
-        <w:rPr>
-          <w:rFonts w:ascii="Times New Roman" w:eastAsia="Times New Roman" w:hAnsi="Times New Roman" w:cs="Times New Roman"/>
-          <w:sz w:val="20"/>
-        </w:rPr>
-        <w:t xml:space="preserve"> </w:t>
-      </w:r>
-      <w:proofErr w:type="spellStart"/>
-      <w:r>
-        <w:rPr>
-          <w:rFonts w:ascii="Times New Roman" w:eastAsia="Times New Roman" w:hAnsi="Times New Roman" w:cs="Times New Roman"/>
-          <w:sz w:val="20"/>
-        </w:rPr>
-        <w:t>završen</w:t>
-      </w:r>
-      <w:proofErr w:type="spellEnd"/>
-      <w:r>
-        <w:rPr>
-          <w:rFonts w:ascii="Times New Roman" w:eastAsia="Times New Roman" w:hAnsi="Times New Roman" w:cs="Times New Roman"/>
-          <w:sz w:val="20"/>
-        </w:rPr>
-        <w:t xml:space="preserve"> za </w:t>
-      </w:r>
-      <w:proofErr w:type="spellStart"/>
-      <w:r>
-        <w:rPr>
-          <w:rFonts w:ascii="Times New Roman" w:eastAsia="Times New Roman" w:hAnsi="Times New Roman" w:cs="Times New Roman"/>
-          <w:sz w:val="20"/>
-        </w:rPr>
-        <w:t>manje</w:t>
-      </w:r>
-      <w:proofErr w:type="spellEnd"/>
-      <w:r>
-        <w:rPr>
-          <w:rFonts w:ascii="Times New Roman" w:eastAsia="Times New Roman" w:hAnsi="Times New Roman" w:cs="Times New Roman"/>
-          <w:sz w:val="20"/>
-        </w:rPr>
-        <w:t xml:space="preserve"> od 2 </w:t>
-      </w:r>
-      <w:proofErr w:type="spellStart"/>
-      <w:r>
-        <w:rPr>
-          <w:rFonts w:ascii="Times New Roman" w:eastAsia="Times New Roman" w:hAnsi="Times New Roman" w:cs="Times New Roman"/>
-          <w:sz w:val="20"/>
-        </w:rPr>
-        <w:t>sekunde</w:t>
-      </w:r>
-      <w:proofErr w:type="spellEnd"/>
-      <w:r>
-        <w:rPr>
-          <w:rFonts w:ascii="Times New Roman" w:eastAsia="Times New Roman" w:hAnsi="Times New Roman" w:cs="Times New Roman"/>
-          <w:sz w:val="20"/>
-        </w:rPr>
-        <w:t xml:space="preserve"> </w:t>
-      </w:r>
-      <w:proofErr w:type="spellStart"/>
-      <w:r>
-        <w:rPr>
-          <w:rFonts w:ascii="Times New Roman" w:eastAsia="Times New Roman" w:hAnsi="Times New Roman" w:cs="Times New Roman"/>
-          <w:sz w:val="20"/>
-        </w:rPr>
-        <w:t>pri</w:t>
-      </w:r>
-      <w:proofErr w:type="spellEnd"/>
-      <w:r>
-        <w:rPr>
-          <w:rFonts w:ascii="Times New Roman" w:eastAsia="Times New Roman" w:hAnsi="Times New Roman" w:cs="Times New Roman"/>
-          <w:sz w:val="20"/>
-        </w:rPr>
-        <w:t xml:space="preserve"> </w:t>
-      </w:r>
-      <w:proofErr w:type="spellStart"/>
-      <w:r>
-        <w:rPr>
-          <w:rFonts w:ascii="Times New Roman" w:eastAsia="Times New Roman" w:hAnsi="Times New Roman" w:cs="Times New Roman"/>
-          <w:sz w:val="20"/>
-        </w:rPr>
-        <w:t>normalnom</w:t>
-      </w:r>
-      <w:proofErr w:type="spellEnd"/>
-      <w:r>
-        <w:rPr>
-          <w:rFonts w:ascii="Times New Roman" w:eastAsia="Times New Roman" w:hAnsi="Times New Roman" w:cs="Times New Roman"/>
-          <w:sz w:val="20"/>
-        </w:rPr>
-        <w:t xml:space="preserve"> </w:t>
-      </w:r>
-      <w:proofErr w:type="spellStart"/>
-      <w:r>
-        <w:rPr>
-          <w:rFonts w:ascii="Times New Roman" w:eastAsia="Times New Roman" w:hAnsi="Times New Roman" w:cs="Times New Roman"/>
-          <w:sz w:val="20"/>
-        </w:rPr>
-        <w:t>opterećenju</w:t>
-      </w:r>
-      <w:proofErr w:type="spellEnd"/>
-      <w:r>
-        <w:rPr>
-          <w:rFonts w:ascii="Times New Roman" w:eastAsia="Times New Roman" w:hAnsi="Times New Roman" w:cs="Times New Roman"/>
-          <w:sz w:val="20"/>
+          <w:rFonts w:ascii="Times New Roman" w:hAnsi="Times New Roman" w:cs="Times New Roman"/>
+          <w:sz w:val="20"/>
+          <w:szCs w:val="22"/>
+        </w:rPr>
+        <w:t>onemogućiti</w:t>
+      </w:r>
+      <w:proofErr w:type="spellEnd"/>
+      <w:r>
+        <w:rPr>
+          <w:rFonts w:ascii="Times New Roman" w:hAnsi="Times New Roman" w:cs="Times New Roman"/>
+          <w:sz w:val="20"/>
+          <w:szCs w:val="22"/>
+        </w:rPr>
+        <w:t xml:space="preserve"> brute-force </w:t>
+      </w:r>
+      <w:proofErr w:type="spellStart"/>
+      <w:r>
+        <w:rPr>
+          <w:rFonts w:ascii="Times New Roman" w:hAnsi="Times New Roman" w:cs="Times New Roman"/>
+          <w:sz w:val="20"/>
+          <w:szCs w:val="22"/>
+        </w:rPr>
+        <w:t>napade</w:t>
+      </w:r>
+      <w:proofErr w:type="spellEnd"/>
+      <w:r>
+        <w:rPr>
+          <w:rFonts w:ascii="Times New Roman" w:hAnsi="Times New Roman" w:cs="Times New Roman"/>
+          <w:sz w:val="20"/>
+          <w:szCs w:val="22"/>
+        </w:rPr>
+        <w:t xml:space="preserve"> </w:t>
+      </w:r>
+      <w:proofErr w:type="spellStart"/>
+      <w:r>
+        <w:rPr>
+          <w:rFonts w:ascii="Times New Roman" w:hAnsi="Times New Roman" w:cs="Times New Roman"/>
+          <w:sz w:val="20"/>
+          <w:szCs w:val="22"/>
+        </w:rPr>
+        <w:t>ograničavanjem</w:t>
+      </w:r>
+      <w:proofErr w:type="spellEnd"/>
+      <w:r>
+        <w:rPr>
+          <w:rFonts w:ascii="Times New Roman" w:hAnsi="Times New Roman" w:cs="Times New Roman"/>
+          <w:sz w:val="20"/>
+          <w:szCs w:val="22"/>
+        </w:rPr>
+        <w:t xml:space="preserve"> </w:t>
+      </w:r>
+      <w:proofErr w:type="spellStart"/>
+      <w:r>
+        <w:rPr>
+          <w:rFonts w:ascii="Times New Roman" w:hAnsi="Times New Roman" w:cs="Times New Roman"/>
+          <w:sz w:val="20"/>
+          <w:szCs w:val="22"/>
+        </w:rPr>
+        <w:t>broja</w:t>
+      </w:r>
+      <w:proofErr w:type="spellEnd"/>
+      <w:r>
+        <w:rPr>
+          <w:rFonts w:ascii="Times New Roman" w:hAnsi="Times New Roman" w:cs="Times New Roman"/>
+          <w:sz w:val="20"/>
+          <w:szCs w:val="22"/>
+        </w:rPr>
+        <w:t xml:space="preserve"> </w:t>
+      </w:r>
+      <w:proofErr w:type="spellStart"/>
+      <w:r>
+        <w:rPr>
+          <w:rFonts w:ascii="Times New Roman" w:hAnsi="Times New Roman" w:cs="Times New Roman"/>
+          <w:sz w:val="20"/>
+          <w:szCs w:val="22"/>
+        </w:rPr>
+        <w:t>pokušaja</w:t>
+      </w:r>
+      <w:proofErr w:type="spellEnd"/>
+      <w:r>
+        <w:rPr>
+          <w:rFonts w:ascii="Times New Roman" w:hAnsi="Times New Roman" w:cs="Times New Roman"/>
+          <w:sz w:val="20"/>
+          <w:szCs w:val="22"/>
         </w:rPr>
         <w:t>.</w:t>
+      </w:r>
+    </w:p>
+    <w:p>
+      <w:pPr>
+        <w:pStyle w:val="Heading2"/>
+        <w:spacing w:after="195"/>
+        <w:ind w:left="705" w:hanging="720"/>
+      </w:pPr>
+      <w:bookmarkStart w:id="14" w:name="_Toc205809943"/>
+      <w:proofErr w:type="spellStart"/>
+      <w:r>
+        <w:t>Preduslovi</w:t>
+      </w:r>
+      <w:bookmarkEnd w:id="14"/>
+      <w:proofErr w:type="spellEnd"/>
+      <w:r>
+        <w:t xml:space="preserve">  </w:t>
       </w:r>
     </w:p>
     <w:p>
@@ -7823,127 +8018,193 @@
         <w:pStyle w:val="ListParagraph"/>
         <w:numPr>
           <w:ilvl w:val="0"/>
-          <w:numId w:val="12"/>
+          <w:numId w:val="15"/>
         </w:numPr>
-        <w:spacing w:after="0" w:line="319" w:lineRule="auto"/>
-        <w:ind w:right="4087"/>
-        <w:rPr>
-          <w:rFonts w:ascii="Times New Roman" w:eastAsia="Times New Roman" w:hAnsi="Times New Roman" w:cs="Times New Roman"/>
-          <w:sz w:val="20"/>
-        </w:rPr>
-      </w:pPr>
-      <w:proofErr w:type="spellStart"/>
-      <w:r>
-        <w:rPr>
-          <w:rFonts w:ascii="Times New Roman" w:eastAsia="Times New Roman" w:hAnsi="Times New Roman" w:cs="Times New Roman"/>
-          <w:sz w:val="20"/>
-        </w:rPr>
-        <w:t>Sistem</w:t>
-      </w:r>
-      <w:proofErr w:type="spellEnd"/>
-      <w:r>
-        <w:rPr>
-          <w:rFonts w:ascii="Times New Roman" w:eastAsia="Times New Roman" w:hAnsi="Times New Roman" w:cs="Times New Roman"/>
-          <w:sz w:val="20"/>
-        </w:rPr>
-        <w:t xml:space="preserve"> mora </w:t>
-      </w:r>
-      <w:proofErr w:type="spellStart"/>
-      <w:r>
-        <w:rPr>
-          <w:rFonts w:ascii="Times New Roman" w:eastAsia="Times New Roman" w:hAnsi="Times New Roman" w:cs="Times New Roman"/>
-          <w:sz w:val="20"/>
-        </w:rPr>
-        <w:t>onemogućiti</w:t>
-      </w:r>
-      <w:proofErr w:type="spellEnd"/>
-      <w:r>
-        <w:rPr>
-          <w:rFonts w:ascii="Times New Roman" w:eastAsia="Times New Roman" w:hAnsi="Times New Roman" w:cs="Times New Roman"/>
-          <w:sz w:val="20"/>
-        </w:rPr>
-        <w:t xml:space="preserve"> brute-force </w:t>
-      </w:r>
-      <w:proofErr w:type="spellStart"/>
-      <w:r>
-        <w:rPr>
-          <w:rFonts w:ascii="Times New Roman" w:eastAsia="Times New Roman" w:hAnsi="Times New Roman" w:cs="Times New Roman"/>
-          <w:sz w:val="20"/>
-        </w:rPr>
-        <w:t>napade</w:t>
-      </w:r>
-      <w:proofErr w:type="spellEnd"/>
-      <w:r>
-        <w:rPr>
-          <w:rFonts w:ascii="Times New Roman" w:eastAsia="Times New Roman" w:hAnsi="Times New Roman" w:cs="Times New Roman"/>
-          <w:sz w:val="20"/>
-        </w:rPr>
-        <w:t xml:space="preserve"> </w:t>
-      </w:r>
-      <w:proofErr w:type="spellStart"/>
-      <w:r>
-        <w:rPr>
-          <w:rFonts w:ascii="Times New Roman" w:eastAsia="Times New Roman" w:hAnsi="Times New Roman" w:cs="Times New Roman"/>
-          <w:sz w:val="20"/>
-        </w:rPr>
-        <w:t>ograničavanjem</w:t>
-      </w:r>
-      <w:proofErr w:type="spellEnd"/>
-      <w:r>
-        <w:rPr>
-          <w:rFonts w:ascii="Times New Roman" w:eastAsia="Times New Roman" w:hAnsi="Times New Roman" w:cs="Times New Roman"/>
-          <w:sz w:val="20"/>
-        </w:rPr>
-        <w:t xml:space="preserve"> </w:t>
-      </w:r>
-      <w:proofErr w:type="spellStart"/>
-      <w:r>
-        <w:rPr>
-          <w:rFonts w:ascii="Times New Roman" w:eastAsia="Times New Roman" w:hAnsi="Times New Roman" w:cs="Times New Roman"/>
-          <w:sz w:val="20"/>
-        </w:rPr>
-        <w:t>broja</w:t>
-      </w:r>
-      <w:proofErr w:type="spellEnd"/>
-      <w:r>
-        <w:rPr>
-          <w:rFonts w:ascii="Times New Roman" w:eastAsia="Times New Roman" w:hAnsi="Times New Roman" w:cs="Times New Roman"/>
-          <w:sz w:val="20"/>
-        </w:rPr>
-        <w:t xml:space="preserve"> </w:t>
-      </w:r>
-      <w:proofErr w:type="spellStart"/>
-      <w:r>
-        <w:rPr>
-          <w:rFonts w:ascii="Times New Roman" w:eastAsia="Times New Roman" w:hAnsi="Times New Roman" w:cs="Times New Roman"/>
-          <w:sz w:val="20"/>
-        </w:rPr>
-        <w:t>pokušaja</w:t>
-      </w:r>
-      <w:proofErr w:type="spellEnd"/>
-      <w:r>
-        <w:rPr>
-          <w:rFonts w:ascii="Times New Roman" w:eastAsia="Times New Roman" w:hAnsi="Times New Roman" w:cs="Times New Roman"/>
-          <w:sz w:val="20"/>
+        <w:rPr>
+          <w:rFonts w:ascii="Times New Roman" w:hAnsi="Times New Roman" w:cs="Times New Roman"/>
+          <w:sz w:val="20"/>
+          <w:szCs w:val="22"/>
+        </w:rPr>
+      </w:pPr>
+      <w:proofErr w:type="spellStart"/>
+      <w:r>
+        <w:rPr>
+          <w:rFonts w:ascii="Times New Roman" w:hAnsi="Times New Roman" w:cs="Times New Roman"/>
+          <w:sz w:val="20"/>
+          <w:szCs w:val="22"/>
+        </w:rPr>
+        <w:t>Korisnik</w:t>
+      </w:r>
+      <w:proofErr w:type="spellEnd"/>
+      <w:r>
+        <w:rPr>
+          <w:rFonts w:ascii="Times New Roman" w:hAnsi="Times New Roman" w:cs="Times New Roman"/>
+          <w:sz w:val="20"/>
+          <w:szCs w:val="22"/>
+        </w:rPr>
+        <w:t xml:space="preserve"> </w:t>
+      </w:r>
+      <w:proofErr w:type="spellStart"/>
+      <w:r>
+        <w:rPr>
+          <w:rFonts w:ascii="Times New Roman" w:hAnsi="Times New Roman" w:cs="Times New Roman"/>
+          <w:sz w:val="20"/>
+          <w:szCs w:val="22"/>
+        </w:rPr>
+        <w:t>ima</w:t>
+      </w:r>
+      <w:proofErr w:type="spellEnd"/>
+      <w:r>
+        <w:rPr>
+          <w:rFonts w:ascii="Times New Roman" w:hAnsi="Times New Roman" w:cs="Times New Roman"/>
+          <w:sz w:val="20"/>
+          <w:szCs w:val="22"/>
+        </w:rPr>
+        <w:t xml:space="preserve"> </w:t>
+      </w:r>
+      <w:proofErr w:type="spellStart"/>
+      <w:r>
+        <w:rPr>
+          <w:rFonts w:ascii="Times New Roman" w:hAnsi="Times New Roman" w:cs="Times New Roman"/>
+          <w:sz w:val="20"/>
+          <w:szCs w:val="22"/>
+        </w:rPr>
+        <w:t>registrovan</w:t>
+      </w:r>
+      <w:proofErr w:type="spellEnd"/>
+      <w:r>
+        <w:rPr>
+          <w:rFonts w:ascii="Times New Roman" w:hAnsi="Times New Roman" w:cs="Times New Roman"/>
+          <w:sz w:val="20"/>
+          <w:szCs w:val="22"/>
+        </w:rPr>
+        <w:t xml:space="preserve"> </w:t>
+      </w:r>
+      <w:proofErr w:type="spellStart"/>
+      <w:r>
+        <w:rPr>
+          <w:rFonts w:ascii="Times New Roman" w:hAnsi="Times New Roman" w:cs="Times New Roman"/>
+          <w:sz w:val="20"/>
+          <w:szCs w:val="22"/>
+        </w:rPr>
+        <w:t>nalog</w:t>
+      </w:r>
+      <w:proofErr w:type="spellEnd"/>
+      <w:r>
+        <w:rPr>
+          <w:rFonts w:ascii="Times New Roman" w:hAnsi="Times New Roman" w:cs="Times New Roman"/>
+          <w:sz w:val="20"/>
+          <w:szCs w:val="22"/>
+        </w:rPr>
+        <w:t xml:space="preserve"> </w:t>
+      </w:r>
+      <w:proofErr w:type="spellStart"/>
+      <w:r>
+        <w:rPr>
+          <w:rFonts w:ascii="Times New Roman" w:hAnsi="Times New Roman" w:cs="Times New Roman"/>
+          <w:sz w:val="20"/>
+          <w:szCs w:val="22"/>
+        </w:rPr>
+        <w:t>sa</w:t>
+      </w:r>
+      <w:proofErr w:type="spellEnd"/>
+      <w:r>
+        <w:rPr>
+          <w:rFonts w:ascii="Times New Roman" w:hAnsi="Times New Roman" w:cs="Times New Roman"/>
+          <w:sz w:val="20"/>
+          <w:szCs w:val="22"/>
+        </w:rPr>
+        <w:t xml:space="preserve"> </w:t>
+      </w:r>
+      <w:proofErr w:type="spellStart"/>
+      <w:r>
+        <w:rPr>
+          <w:rFonts w:ascii="Times New Roman" w:hAnsi="Times New Roman" w:cs="Times New Roman"/>
+          <w:sz w:val="20"/>
+          <w:szCs w:val="22"/>
+        </w:rPr>
+        <w:t>validnim</w:t>
+      </w:r>
+      <w:proofErr w:type="spellEnd"/>
+      <w:r>
+        <w:rPr>
+          <w:rFonts w:ascii="Times New Roman" w:hAnsi="Times New Roman" w:cs="Times New Roman"/>
+          <w:sz w:val="20"/>
+          <w:szCs w:val="22"/>
+        </w:rPr>
+        <w:t xml:space="preserve"> </w:t>
+      </w:r>
+      <w:proofErr w:type="spellStart"/>
+      <w:r>
+        <w:rPr>
+          <w:rFonts w:ascii="Times New Roman" w:hAnsi="Times New Roman" w:cs="Times New Roman"/>
+          <w:sz w:val="20"/>
+          <w:szCs w:val="22"/>
+        </w:rPr>
+        <w:t>korisničkim</w:t>
+      </w:r>
+      <w:proofErr w:type="spellEnd"/>
+      <w:r>
+        <w:rPr>
+          <w:rFonts w:ascii="Times New Roman" w:hAnsi="Times New Roman" w:cs="Times New Roman"/>
+          <w:sz w:val="20"/>
+          <w:szCs w:val="22"/>
+        </w:rPr>
+        <w:t xml:space="preserve"> </w:t>
+      </w:r>
+      <w:proofErr w:type="spellStart"/>
+      <w:r>
+        <w:rPr>
+          <w:rFonts w:ascii="Times New Roman" w:hAnsi="Times New Roman" w:cs="Times New Roman"/>
+          <w:sz w:val="20"/>
+          <w:szCs w:val="22"/>
+        </w:rPr>
+        <w:t>imenom</w:t>
+      </w:r>
+      <w:proofErr w:type="spellEnd"/>
+      <w:r>
+        <w:rPr>
+          <w:rFonts w:ascii="Times New Roman" w:hAnsi="Times New Roman" w:cs="Times New Roman"/>
+          <w:sz w:val="20"/>
+          <w:szCs w:val="22"/>
+        </w:rPr>
+        <w:t xml:space="preserve"> </w:t>
+      </w:r>
+      <w:proofErr w:type="spellStart"/>
+      <w:r>
+        <w:rPr>
+          <w:rFonts w:ascii="Times New Roman" w:hAnsi="Times New Roman" w:cs="Times New Roman"/>
+          <w:sz w:val="20"/>
+          <w:szCs w:val="22"/>
+        </w:rPr>
+        <w:t>i</w:t>
+      </w:r>
+      <w:proofErr w:type="spellEnd"/>
+      <w:r>
+        <w:rPr>
+          <w:rFonts w:ascii="Times New Roman" w:hAnsi="Times New Roman" w:cs="Times New Roman"/>
+          <w:sz w:val="20"/>
+          <w:szCs w:val="22"/>
+        </w:rPr>
+        <w:t xml:space="preserve"> </w:t>
+      </w:r>
+      <w:proofErr w:type="spellStart"/>
+      <w:r>
+        <w:rPr>
+          <w:rFonts w:ascii="Times New Roman" w:hAnsi="Times New Roman" w:cs="Times New Roman"/>
+          <w:sz w:val="20"/>
+          <w:szCs w:val="22"/>
+        </w:rPr>
+        <w:t>lozinkom</w:t>
+      </w:r>
+      <w:proofErr w:type="spellEnd"/>
+      <w:r>
+        <w:rPr>
+          <w:rFonts w:ascii="Times New Roman" w:hAnsi="Times New Roman" w:cs="Times New Roman"/>
+          <w:sz w:val="20"/>
+          <w:szCs w:val="22"/>
         </w:rPr>
         <w:t>.</w:t>
-      </w:r>
-    </w:p>
-    <w:p>
-      <w:pPr>
-        <w:pStyle w:val="Heading2"/>
-        <w:spacing w:after="195"/>
-        <w:ind w:left="705" w:hanging="720"/>
-      </w:pPr>
-      <w:bookmarkStart w:id="14" w:name="_Toc205809943"/>
-      <w:proofErr w:type="spellStart"/>
-      <w:r>
-        <w:t>Preduslovi</w:t>
-      </w:r>
-      <w:bookmarkEnd w:id="14"/>
-      <w:proofErr w:type="spellEnd"/>
-      <w:r>
-        <w:t xml:space="preserve">  </w:t>
       </w:r>
     </w:p>
     <w:p>
@@ -7951,174 +8212,184 @@
         <w:pStyle w:val="ListParagraph"/>
         <w:numPr>
           <w:ilvl w:val="0"/>
-          <w:numId w:val="13"/>
+          <w:numId w:val="15"/>
         </w:numPr>
-        <w:spacing w:after="0" w:line="319" w:lineRule="auto"/>
-        <w:ind w:right="4087"/>
-        <w:rPr>
-          <w:rFonts w:ascii="Times New Roman" w:eastAsia="Times New Roman" w:hAnsi="Times New Roman" w:cs="Times New Roman"/>
-          <w:sz w:val="20"/>
-        </w:rPr>
-      </w:pPr>
-      <w:proofErr w:type="spellStart"/>
-      <w:r>
-        <w:rPr>
-          <w:rFonts w:ascii="Times New Roman" w:eastAsia="Times New Roman" w:hAnsi="Times New Roman" w:cs="Times New Roman"/>
-          <w:sz w:val="20"/>
-        </w:rPr>
-        <w:t>Korisnik</w:t>
-      </w:r>
-      <w:proofErr w:type="spellEnd"/>
-      <w:r>
-        <w:rPr>
-          <w:rFonts w:ascii="Times New Roman" w:eastAsia="Times New Roman" w:hAnsi="Times New Roman" w:cs="Times New Roman"/>
-          <w:sz w:val="20"/>
-        </w:rPr>
-        <w:t xml:space="preserve"> </w:t>
-      </w:r>
-      <w:proofErr w:type="spellStart"/>
-      <w:r>
-        <w:rPr>
-          <w:rFonts w:ascii="Times New Roman" w:eastAsia="Times New Roman" w:hAnsi="Times New Roman" w:cs="Times New Roman"/>
-          <w:sz w:val="20"/>
-        </w:rPr>
-        <w:t>ima</w:t>
-      </w:r>
-      <w:proofErr w:type="spellEnd"/>
-      <w:r>
-        <w:rPr>
-          <w:rFonts w:ascii="Times New Roman" w:eastAsia="Times New Roman" w:hAnsi="Times New Roman" w:cs="Times New Roman"/>
-          <w:sz w:val="20"/>
-        </w:rPr>
-        <w:t xml:space="preserve"> </w:t>
-      </w:r>
-      <w:proofErr w:type="spellStart"/>
-      <w:r>
-        <w:rPr>
-          <w:rFonts w:ascii="Times New Roman" w:eastAsia="Times New Roman" w:hAnsi="Times New Roman" w:cs="Times New Roman"/>
-          <w:sz w:val="20"/>
-        </w:rPr>
-        <w:t>registrovan</w:t>
-      </w:r>
-      <w:proofErr w:type="spellEnd"/>
-      <w:r>
-        <w:rPr>
-          <w:rFonts w:ascii="Times New Roman" w:eastAsia="Times New Roman" w:hAnsi="Times New Roman" w:cs="Times New Roman"/>
-          <w:sz w:val="20"/>
-        </w:rPr>
-        <w:t xml:space="preserve"> </w:t>
-      </w:r>
-      <w:proofErr w:type="spellStart"/>
-      <w:r>
-        <w:rPr>
-          <w:rFonts w:ascii="Times New Roman" w:eastAsia="Times New Roman" w:hAnsi="Times New Roman" w:cs="Times New Roman"/>
-          <w:sz w:val="20"/>
-        </w:rPr>
-        <w:t>nalog</w:t>
-      </w:r>
-      <w:proofErr w:type="spellEnd"/>
-      <w:r>
-        <w:rPr>
-          <w:rFonts w:ascii="Times New Roman" w:eastAsia="Times New Roman" w:hAnsi="Times New Roman" w:cs="Times New Roman"/>
-          <w:sz w:val="20"/>
-        </w:rPr>
-        <w:t xml:space="preserve"> </w:t>
-      </w:r>
-      <w:proofErr w:type="spellStart"/>
-      <w:r>
-        <w:rPr>
-          <w:rFonts w:ascii="Times New Roman" w:eastAsia="Times New Roman" w:hAnsi="Times New Roman" w:cs="Times New Roman"/>
-          <w:sz w:val="20"/>
+        <w:rPr>
+          <w:rFonts w:ascii="Times New Roman" w:hAnsi="Times New Roman" w:cs="Times New Roman"/>
+          <w:sz w:val="20"/>
+          <w:szCs w:val="22"/>
+        </w:rPr>
+      </w:pPr>
+      <w:proofErr w:type="spellStart"/>
+      <w:r>
+        <w:rPr>
+          <w:rFonts w:ascii="Times New Roman" w:hAnsi="Times New Roman" w:cs="Times New Roman"/>
+          <w:sz w:val="20"/>
+          <w:szCs w:val="22"/>
+        </w:rPr>
+        <w:t>Sistem</w:t>
+      </w:r>
+      <w:proofErr w:type="spellEnd"/>
+      <w:r>
+        <w:rPr>
+          <w:rFonts w:ascii="Times New Roman" w:hAnsi="Times New Roman" w:cs="Times New Roman"/>
+          <w:sz w:val="20"/>
+          <w:szCs w:val="22"/>
+        </w:rPr>
+        <w:t xml:space="preserve"> za </w:t>
+      </w:r>
+      <w:proofErr w:type="spellStart"/>
+      <w:r>
+        <w:rPr>
+          <w:rFonts w:ascii="Times New Roman" w:hAnsi="Times New Roman" w:cs="Times New Roman"/>
+          <w:sz w:val="20"/>
+          <w:szCs w:val="22"/>
+        </w:rPr>
+        <w:t>autentifikaciju</w:t>
+      </w:r>
+      <w:proofErr w:type="spellEnd"/>
+      <w:r>
+        <w:rPr>
+          <w:rFonts w:ascii="Times New Roman" w:hAnsi="Times New Roman" w:cs="Times New Roman"/>
+          <w:sz w:val="20"/>
+          <w:szCs w:val="22"/>
+        </w:rPr>
+        <w:t xml:space="preserve"> je </w:t>
+      </w:r>
+      <w:proofErr w:type="spellStart"/>
+      <w:r>
+        <w:rPr>
+          <w:rFonts w:ascii="Times New Roman" w:hAnsi="Times New Roman" w:cs="Times New Roman"/>
+          <w:sz w:val="20"/>
+          <w:szCs w:val="22"/>
+        </w:rPr>
+        <w:t>aktivan</w:t>
+      </w:r>
+      <w:proofErr w:type="spellEnd"/>
+      <w:r>
+        <w:rPr>
+          <w:rFonts w:ascii="Times New Roman" w:hAnsi="Times New Roman" w:cs="Times New Roman"/>
+          <w:sz w:val="20"/>
+          <w:szCs w:val="22"/>
+        </w:rPr>
+        <w:t xml:space="preserve"> </w:t>
+      </w:r>
+      <w:proofErr w:type="spellStart"/>
+      <w:r>
+        <w:rPr>
+          <w:rFonts w:ascii="Times New Roman" w:hAnsi="Times New Roman" w:cs="Times New Roman"/>
+          <w:sz w:val="20"/>
+          <w:szCs w:val="22"/>
+        </w:rPr>
+        <w:t>i</w:t>
+      </w:r>
+      <w:proofErr w:type="spellEnd"/>
+      <w:r>
+        <w:rPr>
+          <w:rFonts w:ascii="Times New Roman" w:hAnsi="Times New Roman" w:cs="Times New Roman"/>
+          <w:sz w:val="20"/>
+          <w:szCs w:val="22"/>
+        </w:rPr>
+        <w:t xml:space="preserve"> </w:t>
+      </w:r>
+      <w:proofErr w:type="spellStart"/>
+      <w:r>
+        <w:rPr>
+          <w:rFonts w:ascii="Times New Roman" w:hAnsi="Times New Roman" w:cs="Times New Roman"/>
+          <w:sz w:val="20"/>
+          <w:szCs w:val="22"/>
+        </w:rPr>
+        <w:t>povezan</w:t>
+      </w:r>
+      <w:proofErr w:type="spellEnd"/>
+      <w:r>
+        <w:rPr>
+          <w:rFonts w:ascii="Times New Roman" w:hAnsi="Times New Roman" w:cs="Times New Roman"/>
+          <w:sz w:val="20"/>
+          <w:szCs w:val="22"/>
+        </w:rPr>
+        <w:t xml:space="preserve"> </w:t>
+      </w:r>
+      <w:proofErr w:type="spellStart"/>
+      <w:r>
+        <w:rPr>
+          <w:rFonts w:ascii="Times New Roman" w:hAnsi="Times New Roman" w:cs="Times New Roman"/>
+          <w:sz w:val="20"/>
+          <w:szCs w:val="22"/>
         </w:rPr>
         <w:t>sa</w:t>
       </w:r>
       <w:proofErr w:type="spellEnd"/>
       <w:r>
         <w:rPr>
-          <w:rFonts w:ascii="Times New Roman" w:eastAsia="Times New Roman" w:hAnsi="Times New Roman" w:cs="Times New Roman"/>
-          <w:sz w:val="20"/>
-        </w:rPr>
-        <w:t xml:space="preserve"> </w:t>
-      </w:r>
-      <w:proofErr w:type="spellStart"/>
-      <w:r>
-        <w:rPr>
-          <w:rFonts w:ascii="Times New Roman" w:eastAsia="Times New Roman" w:hAnsi="Times New Roman" w:cs="Times New Roman"/>
-          <w:sz w:val="20"/>
-        </w:rPr>
-        <w:t>validnim</w:t>
-      </w:r>
-      <w:proofErr w:type="spellEnd"/>
-      <w:r>
-        <w:rPr>
-          <w:rFonts w:ascii="Times New Roman" w:eastAsia="Times New Roman" w:hAnsi="Times New Roman" w:cs="Times New Roman"/>
-          <w:sz w:val="20"/>
-        </w:rPr>
-        <w:t xml:space="preserve"> </w:t>
-      </w:r>
-      <w:proofErr w:type="spellStart"/>
-      <w:r>
-        <w:rPr>
-          <w:rFonts w:ascii="Times New Roman" w:eastAsia="Times New Roman" w:hAnsi="Times New Roman" w:cs="Times New Roman"/>
-          <w:sz w:val="20"/>
-        </w:rPr>
-        <w:t>korisničkim</w:t>
-      </w:r>
-      <w:proofErr w:type="spellEnd"/>
-      <w:r>
-        <w:rPr>
-          <w:rFonts w:ascii="Times New Roman" w:eastAsia="Times New Roman" w:hAnsi="Times New Roman" w:cs="Times New Roman"/>
-          <w:sz w:val="20"/>
-        </w:rPr>
-        <w:t xml:space="preserve"> </w:t>
-      </w:r>
-      <w:proofErr w:type="spellStart"/>
-      <w:r>
-        <w:rPr>
-          <w:rFonts w:ascii="Times New Roman" w:eastAsia="Times New Roman" w:hAnsi="Times New Roman" w:cs="Times New Roman"/>
-          <w:sz w:val="20"/>
-        </w:rPr>
-        <w:t>imenom</w:t>
-      </w:r>
-      <w:proofErr w:type="spellEnd"/>
-      <w:r>
-        <w:rPr>
-          <w:rFonts w:ascii="Times New Roman" w:eastAsia="Times New Roman" w:hAnsi="Times New Roman" w:cs="Times New Roman"/>
-          <w:sz w:val="20"/>
-        </w:rPr>
-        <w:t xml:space="preserve"> </w:t>
-      </w:r>
-      <w:proofErr w:type="spellStart"/>
-      <w:r>
-        <w:rPr>
-          <w:rFonts w:ascii="Times New Roman" w:eastAsia="Times New Roman" w:hAnsi="Times New Roman" w:cs="Times New Roman"/>
-          <w:sz w:val="20"/>
-        </w:rPr>
-        <w:t>i</w:t>
-      </w:r>
-      <w:proofErr w:type="spellEnd"/>
-      <w:r>
-        <w:rPr>
-          <w:rFonts w:ascii="Times New Roman" w:eastAsia="Times New Roman" w:hAnsi="Times New Roman" w:cs="Times New Roman"/>
-          <w:sz w:val="20"/>
-        </w:rPr>
-        <w:t xml:space="preserve"> </w:t>
-      </w:r>
-      <w:proofErr w:type="spellStart"/>
-      <w:r>
-        <w:rPr>
-          <w:rFonts w:ascii="Times New Roman" w:eastAsia="Times New Roman" w:hAnsi="Times New Roman" w:cs="Times New Roman"/>
-          <w:sz w:val="20"/>
-        </w:rPr>
-        <w:t>lozinkom</w:t>
-      </w:r>
-      <w:proofErr w:type="spellEnd"/>
-      <w:r>
-        <w:rPr>
-          <w:rFonts w:ascii="Times New Roman" w:eastAsia="Times New Roman" w:hAnsi="Times New Roman" w:cs="Times New Roman"/>
-          <w:sz w:val="20"/>
-        </w:rPr>
-        <w:t>.</w:t>
+          <w:rFonts w:ascii="Times New Roman" w:hAnsi="Times New Roman" w:cs="Times New Roman"/>
+          <w:sz w:val="20"/>
+          <w:szCs w:val="22"/>
+        </w:rPr>
+        <w:t xml:space="preserve"> </w:t>
+      </w:r>
+      <w:proofErr w:type="spellStart"/>
+      <w:r>
+        <w:rPr>
+          <w:rFonts w:ascii="Times New Roman" w:hAnsi="Times New Roman" w:cs="Times New Roman"/>
+          <w:sz w:val="20"/>
+          <w:szCs w:val="22"/>
+        </w:rPr>
+        <w:t>bazom</w:t>
+      </w:r>
+      <w:proofErr w:type="spellEnd"/>
+      <w:r>
+        <w:rPr>
+          <w:rFonts w:ascii="Times New Roman" w:hAnsi="Times New Roman" w:cs="Times New Roman"/>
+          <w:sz w:val="20"/>
+          <w:szCs w:val="22"/>
+        </w:rPr>
+        <w:t xml:space="preserve"> </w:t>
+      </w:r>
+      <w:proofErr w:type="spellStart"/>
+      <w:r>
+        <w:rPr>
+          <w:rFonts w:ascii="Times New Roman" w:hAnsi="Times New Roman" w:cs="Times New Roman"/>
+          <w:sz w:val="20"/>
+          <w:szCs w:val="22"/>
+        </w:rPr>
+        <w:t>podataka</w:t>
+      </w:r>
+      <w:proofErr w:type="spellEnd"/>
+      <w:r>
+        <w:rPr>
+          <w:rFonts w:ascii="Times New Roman" w:hAnsi="Times New Roman" w:cs="Times New Roman"/>
+          <w:sz w:val="20"/>
+          <w:szCs w:val="22"/>
+        </w:rPr>
+        <w:t xml:space="preserve"> </w:t>
+      </w:r>
+      <w:proofErr w:type="spellStart"/>
+      <w:r>
+        <w:rPr>
+          <w:rFonts w:ascii="Times New Roman" w:hAnsi="Times New Roman" w:cs="Times New Roman"/>
+          <w:sz w:val="20"/>
+          <w:szCs w:val="22"/>
+        </w:rPr>
+        <w:t>korisnika</w:t>
+      </w:r>
+      <w:proofErr w:type="spellEnd"/>
+    </w:p>
+    <w:p>
+      <w:pPr>
+        <w:pStyle w:val="Heading2"/>
+        <w:spacing w:after="90"/>
+        <w:ind w:left="705" w:hanging="720"/>
+      </w:pPr>
+      <w:bookmarkStart w:id="15" w:name="_Toc205809944"/>
+      <w:proofErr w:type="spellStart"/>
+      <w:r>
+        <w:t>Posledice</w:t>
+      </w:r>
+      <w:bookmarkEnd w:id="15"/>
+      <w:proofErr w:type="spellEnd"/>
+      <w:r>
+        <w:t xml:space="preserve"> </w:t>
       </w:r>
     </w:p>
     <w:p>
@@ -8126,168 +8397,219 @@
         <w:pStyle w:val="ListParagraph"/>
         <w:numPr>
           <w:ilvl w:val="0"/>
-          <w:numId w:val="13"/>
+          <w:numId w:val="16"/>
         </w:numPr>
-        <w:spacing w:after="0" w:line="319" w:lineRule="auto"/>
-        <w:ind w:right="4087"/>
-        <w:rPr>
-          <w:rFonts w:ascii="Times New Roman" w:eastAsia="Times New Roman" w:hAnsi="Times New Roman" w:cs="Times New Roman"/>
-          <w:sz w:val="20"/>
-        </w:rPr>
-      </w:pPr>
-      <w:proofErr w:type="spellStart"/>
-      <w:r>
-        <w:rPr>
-          <w:rFonts w:ascii="Times New Roman" w:eastAsia="Times New Roman" w:hAnsi="Times New Roman" w:cs="Times New Roman"/>
-          <w:sz w:val="20"/>
-        </w:rPr>
-        <w:t>Sistem</w:t>
-      </w:r>
-      <w:proofErr w:type="spellEnd"/>
-      <w:r>
-        <w:rPr>
-          <w:rFonts w:ascii="Times New Roman" w:eastAsia="Times New Roman" w:hAnsi="Times New Roman" w:cs="Times New Roman"/>
-          <w:sz w:val="20"/>
-        </w:rPr>
-        <w:t xml:space="preserve"> za </w:t>
-      </w:r>
-      <w:proofErr w:type="spellStart"/>
-      <w:r>
-        <w:rPr>
-          <w:rFonts w:ascii="Times New Roman" w:eastAsia="Times New Roman" w:hAnsi="Times New Roman" w:cs="Times New Roman"/>
-          <w:sz w:val="20"/>
-        </w:rPr>
-        <w:t>autentifikaciju</w:t>
-      </w:r>
-      <w:proofErr w:type="spellEnd"/>
-      <w:r>
-        <w:rPr>
-          <w:rFonts w:ascii="Times New Roman" w:eastAsia="Times New Roman" w:hAnsi="Times New Roman" w:cs="Times New Roman"/>
-          <w:sz w:val="20"/>
-        </w:rPr>
-        <w:t xml:space="preserve"> je </w:t>
-      </w:r>
-      <w:proofErr w:type="spellStart"/>
-      <w:r>
-        <w:rPr>
-          <w:rFonts w:ascii="Times New Roman" w:eastAsia="Times New Roman" w:hAnsi="Times New Roman" w:cs="Times New Roman"/>
-          <w:sz w:val="20"/>
-        </w:rPr>
-        <w:t>aktivan</w:t>
-      </w:r>
-      <w:proofErr w:type="spellEnd"/>
-      <w:r>
-        <w:rPr>
-          <w:rFonts w:ascii="Times New Roman" w:eastAsia="Times New Roman" w:hAnsi="Times New Roman" w:cs="Times New Roman"/>
-          <w:sz w:val="20"/>
-        </w:rPr>
-        <w:t xml:space="preserve"> </w:t>
-      </w:r>
-      <w:proofErr w:type="spellStart"/>
-      <w:r>
-        <w:rPr>
-          <w:rFonts w:ascii="Times New Roman" w:eastAsia="Times New Roman" w:hAnsi="Times New Roman" w:cs="Times New Roman"/>
-          <w:sz w:val="20"/>
+        <w:rPr>
+          <w:rFonts w:ascii="Times New Roman" w:hAnsi="Times New Roman" w:cs="Times New Roman"/>
+          <w:sz w:val="20"/>
+          <w:szCs w:val="22"/>
+        </w:rPr>
+      </w:pPr>
+      <w:r>
+        <w:rPr>
+          <w:rFonts w:ascii="Times New Roman" w:hAnsi="Times New Roman" w:cs="Times New Roman"/>
+          <w:sz w:val="20"/>
+          <w:szCs w:val="22"/>
+        </w:rPr>
+        <w:t xml:space="preserve">U </w:t>
+      </w:r>
+      <w:proofErr w:type="spellStart"/>
+      <w:r>
+        <w:rPr>
+          <w:rFonts w:ascii="Times New Roman" w:hAnsi="Times New Roman" w:cs="Times New Roman"/>
+          <w:sz w:val="20"/>
+          <w:szCs w:val="22"/>
+        </w:rPr>
+        <w:t>slučaju</w:t>
+      </w:r>
+      <w:proofErr w:type="spellEnd"/>
+      <w:r>
+        <w:rPr>
+          <w:rFonts w:ascii="Times New Roman" w:hAnsi="Times New Roman" w:cs="Times New Roman"/>
+          <w:sz w:val="20"/>
+          <w:szCs w:val="22"/>
+        </w:rPr>
+        <w:t xml:space="preserve"> </w:t>
+      </w:r>
+      <w:proofErr w:type="spellStart"/>
+      <w:r>
+        <w:rPr>
+          <w:rFonts w:ascii="Times New Roman" w:hAnsi="Times New Roman" w:cs="Times New Roman"/>
+          <w:sz w:val="20"/>
+          <w:szCs w:val="22"/>
+        </w:rPr>
+        <w:t>uspešne</w:t>
+      </w:r>
+      <w:proofErr w:type="spellEnd"/>
+      <w:r>
+        <w:rPr>
+          <w:rFonts w:ascii="Times New Roman" w:hAnsi="Times New Roman" w:cs="Times New Roman"/>
+          <w:sz w:val="20"/>
+          <w:szCs w:val="22"/>
+        </w:rPr>
+        <w:t xml:space="preserve"> </w:t>
+      </w:r>
+      <w:proofErr w:type="spellStart"/>
+      <w:r>
+        <w:rPr>
+          <w:rFonts w:ascii="Times New Roman" w:hAnsi="Times New Roman" w:cs="Times New Roman"/>
+          <w:sz w:val="20"/>
+          <w:szCs w:val="22"/>
+        </w:rPr>
+        <w:t>prijave</w:t>
+      </w:r>
+      <w:proofErr w:type="spellEnd"/>
+      <w:r>
+        <w:rPr>
+          <w:rFonts w:ascii="Times New Roman" w:hAnsi="Times New Roman" w:cs="Times New Roman"/>
+          <w:sz w:val="20"/>
+          <w:szCs w:val="22"/>
+        </w:rPr>
+        <w:t xml:space="preserve">, </w:t>
+      </w:r>
+      <w:proofErr w:type="spellStart"/>
+      <w:r>
+        <w:rPr>
+          <w:rFonts w:ascii="Times New Roman" w:hAnsi="Times New Roman" w:cs="Times New Roman"/>
+          <w:sz w:val="20"/>
+          <w:szCs w:val="22"/>
+        </w:rPr>
+        <w:t>korisniku</w:t>
+      </w:r>
+      <w:proofErr w:type="spellEnd"/>
+      <w:r>
+        <w:rPr>
+          <w:rFonts w:ascii="Times New Roman" w:hAnsi="Times New Roman" w:cs="Times New Roman"/>
+          <w:sz w:val="20"/>
+          <w:szCs w:val="22"/>
+        </w:rPr>
+        <w:t xml:space="preserve"> se </w:t>
+      </w:r>
+      <w:proofErr w:type="spellStart"/>
+      <w:r>
+        <w:rPr>
+          <w:rFonts w:ascii="Times New Roman" w:hAnsi="Times New Roman" w:cs="Times New Roman"/>
+          <w:sz w:val="20"/>
+          <w:szCs w:val="22"/>
+        </w:rPr>
+        <w:t>dodeljuje</w:t>
+      </w:r>
+      <w:proofErr w:type="spellEnd"/>
+      <w:r>
+        <w:rPr>
+          <w:rFonts w:ascii="Times New Roman" w:hAnsi="Times New Roman" w:cs="Times New Roman"/>
+          <w:sz w:val="20"/>
+          <w:szCs w:val="22"/>
+        </w:rPr>
+        <w:t xml:space="preserve"> </w:t>
+      </w:r>
+      <w:proofErr w:type="spellStart"/>
+      <w:r>
+        <w:rPr>
+          <w:rFonts w:ascii="Times New Roman" w:hAnsi="Times New Roman" w:cs="Times New Roman"/>
+          <w:sz w:val="20"/>
+          <w:szCs w:val="22"/>
+        </w:rPr>
+        <w:t>sesija</w:t>
+      </w:r>
+      <w:proofErr w:type="spellEnd"/>
+      <w:r>
+        <w:rPr>
+          <w:rFonts w:ascii="Times New Roman" w:hAnsi="Times New Roman" w:cs="Times New Roman"/>
+          <w:sz w:val="20"/>
+          <w:szCs w:val="22"/>
+        </w:rPr>
+        <w:t xml:space="preserve"> </w:t>
+      </w:r>
+      <w:proofErr w:type="spellStart"/>
+      <w:r>
+        <w:rPr>
+          <w:rFonts w:ascii="Times New Roman" w:hAnsi="Times New Roman" w:cs="Times New Roman"/>
+          <w:sz w:val="20"/>
+          <w:szCs w:val="22"/>
         </w:rPr>
         <w:t>i</w:t>
       </w:r>
       <w:proofErr w:type="spellEnd"/>
       <w:r>
         <w:rPr>
-          <w:rFonts w:ascii="Times New Roman" w:eastAsia="Times New Roman" w:hAnsi="Times New Roman" w:cs="Times New Roman"/>
-          <w:sz w:val="20"/>
-        </w:rPr>
-        <w:t xml:space="preserve"> </w:t>
-      </w:r>
-      <w:proofErr w:type="spellStart"/>
-      <w:r>
-        <w:rPr>
-          <w:rFonts w:ascii="Times New Roman" w:eastAsia="Times New Roman" w:hAnsi="Times New Roman" w:cs="Times New Roman"/>
-          <w:sz w:val="20"/>
-        </w:rPr>
-        <w:t>povezan</w:t>
-      </w:r>
-      <w:proofErr w:type="spellEnd"/>
-      <w:r>
-        <w:rPr>
-          <w:rFonts w:ascii="Times New Roman" w:eastAsia="Times New Roman" w:hAnsi="Times New Roman" w:cs="Times New Roman"/>
-          <w:sz w:val="20"/>
-        </w:rPr>
-        <w:t xml:space="preserve"> </w:t>
-      </w:r>
-      <w:proofErr w:type="spellStart"/>
-      <w:r>
-        <w:rPr>
-          <w:rFonts w:ascii="Times New Roman" w:eastAsia="Times New Roman" w:hAnsi="Times New Roman" w:cs="Times New Roman"/>
-          <w:sz w:val="20"/>
-        </w:rPr>
-        <w:t>sa</w:t>
-      </w:r>
-      <w:proofErr w:type="spellEnd"/>
-      <w:r>
-        <w:rPr>
-          <w:rFonts w:ascii="Times New Roman" w:eastAsia="Times New Roman" w:hAnsi="Times New Roman" w:cs="Times New Roman"/>
-          <w:sz w:val="20"/>
-        </w:rPr>
-        <w:t xml:space="preserve"> </w:t>
-      </w:r>
-      <w:proofErr w:type="spellStart"/>
-      <w:r>
-        <w:rPr>
-          <w:rFonts w:ascii="Times New Roman" w:eastAsia="Times New Roman" w:hAnsi="Times New Roman" w:cs="Times New Roman"/>
-          <w:sz w:val="20"/>
-        </w:rPr>
-        <w:t>bazom</w:t>
-      </w:r>
-      <w:proofErr w:type="spellEnd"/>
-      <w:r>
-        <w:rPr>
-          <w:rFonts w:ascii="Times New Roman" w:eastAsia="Times New Roman" w:hAnsi="Times New Roman" w:cs="Times New Roman"/>
-          <w:sz w:val="20"/>
-        </w:rPr>
-        <w:t xml:space="preserve"> </w:t>
-      </w:r>
-      <w:proofErr w:type="spellStart"/>
-      <w:r>
-        <w:rPr>
-          <w:rFonts w:ascii="Times New Roman" w:eastAsia="Times New Roman" w:hAnsi="Times New Roman" w:cs="Times New Roman"/>
-          <w:sz w:val="20"/>
-        </w:rPr>
-        <w:t>podataka</w:t>
-      </w:r>
-      <w:proofErr w:type="spellEnd"/>
-      <w:r>
-        <w:rPr>
-          <w:rFonts w:ascii="Times New Roman" w:eastAsia="Times New Roman" w:hAnsi="Times New Roman" w:cs="Times New Roman"/>
-          <w:sz w:val="20"/>
-        </w:rPr>
-        <w:t xml:space="preserve"> </w:t>
-      </w:r>
-      <w:proofErr w:type="spellStart"/>
-      <w:r>
-        <w:rPr>
-          <w:rFonts w:ascii="Times New Roman" w:eastAsia="Times New Roman" w:hAnsi="Times New Roman" w:cs="Times New Roman"/>
-          <w:sz w:val="20"/>
-        </w:rPr>
-        <w:t>korisnika</w:t>
-      </w:r>
-      <w:proofErr w:type="spellEnd"/>
-    </w:p>
-    <w:p>
-      <w:pPr>
-        <w:pStyle w:val="Heading2"/>
-        <w:spacing w:after="90"/>
-        <w:ind w:left="705" w:hanging="720"/>
-      </w:pPr>
-      <w:bookmarkStart w:id="15" w:name="_Toc205809944"/>
-      <w:proofErr w:type="spellStart"/>
-      <w:r>
-        <w:t>Posledice</w:t>
-      </w:r>
-      <w:bookmarkEnd w:id="15"/>
-      <w:proofErr w:type="spellEnd"/>
-      <w:r>
-        <w:t xml:space="preserve"> </w:t>
+          <w:rFonts w:ascii="Times New Roman" w:hAnsi="Times New Roman" w:cs="Times New Roman"/>
+          <w:sz w:val="20"/>
+          <w:szCs w:val="22"/>
+        </w:rPr>
+        <w:t xml:space="preserve"> </w:t>
+      </w:r>
+      <w:proofErr w:type="spellStart"/>
+      <w:r>
+        <w:rPr>
+          <w:rFonts w:ascii="Times New Roman" w:hAnsi="Times New Roman" w:cs="Times New Roman"/>
+          <w:sz w:val="20"/>
+          <w:szCs w:val="22"/>
+        </w:rPr>
+        <w:t>omogućava</w:t>
+      </w:r>
+      <w:proofErr w:type="spellEnd"/>
+      <w:r>
+        <w:rPr>
+          <w:rFonts w:ascii="Times New Roman" w:hAnsi="Times New Roman" w:cs="Times New Roman"/>
+          <w:sz w:val="20"/>
+          <w:szCs w:val="22"/>
+        </w:rPr>
+        <w:t xml:space="preserve"> </w:t>
+      </w:r>
+      <w:proofErr w:type="spellStart"/>
+      <w:r>
+        <w:rPr>
+          <w:rFonts w:ascii="Times New Roman" w:hAnsi="Times New Roman" w:cs="Times New Roman"/>
+          <w:sz w:val="20"/>
+          <w:szCs w:val="22"/>
+        </w:rPr>
+        <w:t>pristup</w:t>
+      </w:r>
+      <w:proofErr w:type="spellEnd"/>
+      <w:r>
+        <w:rPr>
+          <w:rFonts w:ascii="Times New Roman" w:hAnsi="Times New Roman" w:cs="Times New Roman"/>
+          <w:sz w:val="20"/>
+          <w:szCs w:val="22"/>
+        </w:rPr>
+        <w:t xml:space="preserve"> </w:t>
+      </w:r>
+      <w:proofErr w:type="spellStart"/>
+      <w:r>
+        <w:rPr>
+          <w:rFonts w:ascii="Times New Roman" w:hAnsi="Times New Roman" w:cs="Times New Roman"/>
+          <w:sz w:val="20"/>
+          <w:szCs w:val="22"/>
+        </w:rPr>
+        <w:t>zaštićenim</w:t>
+      </w:r>
+      <w:proofErr w:type="spellEnd"/>
+      <w:r>
+        <w:rPr>
+          <w:rFonts w:ascii="Times New Roman" w:hAnsi="Times New Roman" w:cs="Times New Roman"/>
+          <w:sz w:val="20"/>
+          <w:szCs w:val="22"/>
+        </w:rPr>
+        <w:t xml:space="preserve"> </w:t>
+      </w:r>
+      <w:proofErr w:type="spellStart"/>
+      <w:r>
+        <w:rPr>
+          <w:rFonts w:ascii="Times New Roman" w:hAnsi="Times New Roman" w:cs="Times New Roman"/>
+          <w:sz w:val="20"/>
+          <w:szCs w:val="22"/>
+        </w:rPr>
+        <w:t>funkcionalnostima</w:t>
+      </w:r>
+      <w:proofErr w:type="spellEnd"/>
+      <w:r>
+        <w:rPr>
+          <w:rFonts w:ascii="Times New Roman" w:hAnsi="Times New Roman" w:cs="Times New Roman"/>
+          <w:sz w:val="20"/>
+          <w:szCs w:val="22"/>
+        </w:rPr>
+        <w:t>.</w:t>
       </w:r>
     </w:p>
     <w:p>
@@ -8295,447 +8617,267 @@
         <w:pStyle w:val="ListParagraph"/>
         <w:numPr>
           <w:ilvl w:val="0"/>
-          <w:numId w:val="13"/>
+          <w:numId w:val="16"/>
         </w:numPr>
-        <w:spacing w:after="0" w:line="319" w:lineRule="auto"/>
-        <w:ind w:right="4087"/>
-        <w:rPr>
-          <w:rFonts w:ascii="Times New Roman" w:eastAsia="Times New Roman" w:hAnsi="Times New Roman" w:cs="Times New Roman"/>
-          <w:sz w:val="20"/>
-        </w:rPr>
-      </w:pPr>
-      <w:r>
-        <w:rPr>
-          <w:rFonts w:ascii="Times New Roman" w:eastAsia="Times New Roman" w:hAnsi="Times New Roman" w:cs="Times New Roman"/>
-          <w:sz w:val="20"/>
+      </w:pPr>
+      <w:r>
+        <w:rPr>
+          <w:rFonts w:ascii="Times New Roman" w:hAnsi="Times New Roman" w:cs="Times New Roman"/>
+          <w:sz w:val="20"/>
+          <w:szCs w:val="22"/>
         </w:rPr>
         <w:t xml:space="preserve">U </w:t>
       </w:r>
       <w:proofErr w:type="spellStart"/>
       <w:r>
         <w:rPr>
-          <w:rFonts w:ascii="Times New Roman" w:eastAsia="Times New Roman" w:hAnsi="Times New Roman" w:cs="Times New Roman"/>
-          <w:sz w:val="20"/>
+          <w:rFonts w:ascii="Times New Roman" w:hAnsi="Times New Roman" w:cs="Times New Roman"/>
+          <w:sz w:val="20"/>
+          <w:szCs w:val="22"/>
         </w:rPr>
         <w:t>slučaju</w:t>
       </w:r>
       <w:proofErr w:type="spellEnd"/>
       <w:r>
         <w:rPr>
-          <w:rFonts w:ascii="Times New Roman" w:eastAsia="Times New Roman" w:hAnsi="Times New Roman" w:cs="Times New Roman"/>
-          <w:sz w:val="20"/>
-        </w:rPr>
-        <w:t xml:space="preserve"> </w:t>
-      </w:r>
-      <w:proofErr w:type="spellStart"/>
-      <w:r>
-        <w:rPr>
-          <w:rFonts w:ascii="Times New Roman" w:eastAsia="Times New Roman" w:hAnsi="Times New Roman" w:cs="Times New Roman"/>
-          <w:sz w:val="20"/>
-        </w:rPr>
-        <w:t>uspešne</w:t>
-      </w:r>
-      <w:proofErr w:type="spellEnd"/>
-      <w:r>
-        <w:rPr>
-          <w:rFonts w:ascii="Times New Roman" w:eastAsia="Times New Roman" w:hAnsi="Times New Roman" w:cs="Times New Roman"/>
-          <w:sz w:val="20"/>
-        </w:rPr>
-        <w:t xml:space="preserve"> </w:t>
-      </w:r>
-      <w:proofErr w:type="spellStart"/>
-      <w:r>
-        <w:rPr>
-          <w:rFonts w:ascii="Times New Roman" w:eastAsia="Times New Roman" w:hAnsi="Times New Roman" w:cs="Times New Roman"/>
-          <w:sz w:val="20"/>
+          <w:rFonts w:ascii="Times New Roman" w:hAnsi="Times New Roman" w:cs="Times New Roman"/>
+          <w:sz w:val="20"/>
+          <w:szCs w:val="22"/>
+        </w:rPr>
+        <w:t xml:space="preserve"> </w:t>
+      </w:r>
+      <w:proofErr w:type="spellStart"/>
+      <w:r>
+        <w:rPr>
+          <w:rFonts w:ascii="Times New Roman" w:hAnsi="Times New Roman" w:cs="Times New Roman"/>
+          <w:sz w:val="20"/>
+          <w:szCs w:val="22"/>
+        </w:rPr>
+        <w:t>neuspešne</w:t>
+      </w:r>
+      <w:proofErr w:type="spellEnd"/>
+      <w:r>
+        <w:rPr>
+          <w:rFonts w:ascii="Times New Roman" w:hAnsi="Times New Roman" w:cs="Times New Roman"/>
+          <w:sz w:val="20"/>
+          <w:szCs w:val="22"/>
+        </w:rPr>
+        <w:t xml:space="preserve"> </w:t>
+      </w:r>
+      <w:proofErr w:type="spellStart"/>
+      <w:r>
+        <w:rPr>
+          <w:rFonts w:ascii="Times New Roman" w:hAnsi="Times New Roman" w:cs="Times New Roman"/>
+          <w:sz w:val="20"/>
+          <w:szCs w:val="22"/>
         </w:rPr>
         <w:t>prijave</w:t>
       </w:r>
       <w:proofErr w:type="spellEnd"/>
       <w:r>
         <w:rPr>
-          <w:rFonts w:ascii="Times New Roman" w:eastAsia="Times New Roman" w:hAnsi="Times New Roman" w:cs="Times New Roman"/>
-          <w:sz w:val="20"/>
+          <w:rFonts w:ascii="Times New Roman" w:hAnsi="Times New Roman" w:cs="Times New Roman"/>
+          <w:sz w:val="20"/>
+          <w:szCs w:val="22"/>
         </w:rPr>
         <w:t xml:space="preserve">, </w:t>
       </w:r>
       <w:proofErr w:type="spellStart"/>
       <w:r>
         <w:rPr>
-          <w:rFonts w:ascii="Times New Roman" w:eastAsia="Times New Roman" w:hAnsi="Times New Roman" w:cs="Times New Roman"/>
-          <w:sz w:val="20"/>
-        </w:rPr>
-        <w:t>korisniku</w:t>
-      </w:r>
-      <w:proofErr w:type="spellEnd"/>
-      <w:r>
-        <w:rPr>
-          <w:rFonts w:ascii="Times New Roman" w:eastAsia="Times New Roman" w:hAnsi="Times New Roman" w:cs="Times New Roman"/>
-          <w:sz w:val="20"/>
-        </w:rPr>
-        <w:t xml:space="preserve"> se </w:t>
-      </w:r>
-      <w:proofErr w:type="spellStart"/>
-      <w:r>
-        <w:rPr>
-          <w:rFonts w:ascii="Times New Roman" w:eastAsia="Times New Roman" w:hAnsi="Times New Roman" w:cs="Times New Roman"/>
-          <w:sz w:val="20"/>
-        </w:rPr>
-        <w:t>dodeljuje</w:t>
-      </w:r>
-      <w:proofErr w:type="spellEnd"/>
-      <w:r>
-        <w:rPr>
-          <w:rFonts w:ascii="Times New Roman" w:eastAsia="Times New Roman" w:hAnsi="Times New Roman" w:cs="Times New Roman"/>
-          <w:sz w:val="20"/>
-        </w:rPr>
-        <w:t xml:space="preserve"> </w:t>
-      </w:r>
-      <w:proofErr w:type="spellStart"/>
-      <w:r>
-        <w:rPr>
-          <w:rFonts w:ascii="Times New Roman" w:eastAsia="Times New Roman" w:hAnsi="Times New Roman" w:cs="Times New Roman"/>
-          <w:sz w:val="20"/>
-        </w:rPr>
-        <w:t>sesija</w:t>
-      </w:r>
-      <w:proofErr w:type="spellEnd"/>
-      <w:r>
-        <w:rPr>
-          <w:rFonts w:ascii="Times New Roman" w:eastAsia="Times New Roman" w:hAnsi="Times New Roman" w:cs="Times New Roman"/>
-          <w:sz w:val="20"/>
-        </w:rPr>
-        <w:t xml:space="preserve"> </w:t>
-      </w:r>
-      <w:proofErr w:type="spellStart"/>
-      <w:r>
-        <w:rPr>
-          <w:rFonts w:ascii="Times New Roman" w:eastAsia="Times New Roman" w:hAnsi="Times New Roman" w:cs="Times New Roman"/>
-          <w:sz w:val="20"/>
+          <w:rFonts w:ascii="Times New Roman" w:hAnsi="Times New Roman" w:cs="Times New Roman"/>
+          <w:sz w:val="20"/>
+          <w:szCs w:val="22"/>
+        </w:rPr>
+        <w:t>sistem</w:t>
+      </w:r>
+      <w:proofErr w:type="spellEnd"/>
+      <w:r>
+        <w:rPr>
+          <w:rFonts w:ascii="Times New Roman" w:hAnsi="Times New Roman" w:cs="Times New Roman"/>
+          <w:sz w:val="20"/>
+          <w:szCs w:val="22"/>
+        </w:rPr>
+        <w:t xml:space="preserve"> </w:t>
+      </w:r>
+      <w:proofErr w:type="spellStart"/>
+      <w:r>
+        <w:rPr>
+          <w:rFonts w:ascii="Times New Roman" w:hAnsi="Times New Roman" w:cs="Times New Roman"/>
+          <w:sz w:val="20"/>
+          <w:szCs w:val="22"/>
+        </w:rPr>
+        <w:t>beleži</w:t>
+      </w:r>
+      <w:proofErr w:type="spellEnd"/>
+      <w:r>
+        <w:rPr>
+          <w:rFonts w:ascii="Times New Roman" w:hAnsi="Times New Roman" w:cs="Times New Roman"/>
+          <w:sz w:val="20"/>
+          <w:szCs w:val="22"/>
+        </w:rPr>
+        <w:t xml:space="preserve"> </w:t>
+      </w:r>
+      <w:proofErr w:type="spellStart"/>
+      <w:r>
+        <w:rPr>
+          <w:rFonts w:ascii="Times New Roman" w:hAnsi="Times New Roman" w:cs="Times New Roman"/>
+          <w:sz w:val="20"/>
+          <w:szCs w:val="22"/>
+        </w:rPr>
+        <w:t>pokušaj</w:t>
+      </w:r>
+      <w:proofErr w:type="spellEnd"/>
+      <w:r>
+        <w:rPr>
+          <w:rFonts w:ascii="Times New Roman" w:hAnsi="Times New Roman" w:cs="Times New Roman"/>
+          <w:sz w:val="20"/>
+          <w:szCs w:val="22"/>
+        </w:rPr>
+        <w:t xml:space="preserve"> </w:t>
+      </w:r>
+      <w:proofErr w:type="spellStart"/>
+      <w:r>
+        <w:rPr>
+          <w:rFonts w:ascii="Times New Roman" w:hAnsi="Times New Roman" w:cs="Times New Roman"/>
+          <w:sz w:val="20"/>
+          <w:szCs w:val="22"/>
         </w:rPr>
         <w:t>i</w:t>
       </w:r>
       <w:proofErr w:type="spellEnd"/>
       <w:r>
         <w:rPr>
-          <w:rFonts w:ascii="Times New Roman" w:eastAsia="Times New Roman" w:hAnsi="Times New Roman" w:cs="Times New Roman"/>
-          <w:sz w:val="20"/>
-        </w:rPr>
-        <w:t xml:space="preserve"> </w:t>
-      </w:r>
-      <w:proofErr w:type="spellStart"/>
-      <w:r>
-        <w:rPr>
-          <w:rFonts w:ascii="Times New Roman" w:eastAsia="Times New Roman" w:hAnsi="Times New Roman" w:cs="Times New Roman"/>
-          <w:sz w:val="20"/>
-        </w:rPr>
-        <w:t>omogućava</w:t>
-      </w:r>
-      <w:proofErr w:type="spellEnd"/>
-      <w:r>
-        <w:rPr>
-          <w:rFonts w:ascii="Times New Roman" w:eastAsia="Times New Roman" w:hAnsi="Times New Roman" w:cs="Times New Roman"/>
-          <w:sz w:val="20"/>
-        </w:rPr>
-        <w:t xml:space="preserve"> </w:t>
-      </w:r>
-      <w:proofErr w:type="spellStart"/>
-      <w:r>
-        <w:rPr>
-          <w:rFonts w:ascii="Times New Roman" w:eastAsia="Times New Roman" w:hAnsi="Times New Roman" w:cs="Times New Roman"/>
-          <w:sz w:val="20"/>
-        </w:rPr>
-        <w:t>pristup</w:t>
-      </w:r>
-      <w:proofErr w:type="spellEnd"/>
-      <w:r>
-        <w:rPr>
-          <w:rFonts w:ascii="Times New Roman" w:eastAsia="Times New Roman" w:hAnsi="Times New Roman" w:cs="Times New Roman"/>
-          <w:sz w:val="20"/>
-        </w:rPr>
-        <w:t xml:space="preserve"> </w:t>
-      </w:r>
-      <w:proofErr w:type="spellStart"/>
-      <w:r>
-        <w:rPr>
-          <w:rFonts w:ascii="Times New Roman" w:eastAsia="Times New Roman" w:hAnsi="Times New Roman" w:cs="Times New Roman"/>
-          <w:sz w:val="20"/>
-        </w:rPr>
-        <w:t>zaštićenim</w:t>
-      </w:r>
-      <w:proofErr w:type="spellEnd"/>
-      <w:r>
-        <w:rPr>
-          <w:rFonts w:ascii="Times New Roman" w:eastAsia="Times New Roman" w:hAnsi="Times New Roman" w:cs="Times New Roman"/>
-          <w:sz w:val="20"/>
-        </w:rPr>
-        <w:t xml:space="preserve"> </w:t>
-      </w:r>
-      <w:proofErr w:type="spellStart"/>
-      <w:r>
-        <w:rPr>
-          <w:rFonts w:ascii="Times New Roman" w:eastAsia="Times New Roman" w:hAnsi="Times New Roman" w:cs="Times New Roman"/>
-          <w:sz w:val="20"/>
-        </w:rPr>
-        <w:t>funkcionalnostima</w:t>
-      </w:r>
-      <w:proofErr w:type="spellEnd"/>
-      <w:r>
-        <w:rPr>
-          <w:rFonts w:ascii="Times New Roman" w:eastAsia="Times New Roman" w:hAnsi="Times New Roman" w:cs="Times New Roman"/>
-          <w:sz w:val="20"/>
-        </w:rPr>
+          <w:rFonts w:ascii="Times New Roman" w:hAnsi="Times New Roman" w:cs="Times New Roman"/>
+          <w:sz w:val="20"/>
+          <w:szCs w:val="22"/>
+        </w:rPr>
+        <w:t xml:space="preserve"> po </w:t>
+      </w:r>
+      <w:proofErr w:type="spellStart"/>
+      <w:r>
+        <w:rPr>
+          <w:rFonts w:ascii="Times New Roman" w:hAnsi="Times New Roman" w:cs="Times New Roman"/>
+          <w:sz w:val="20"/>
+          <w:szCs w:val="22"/>
+        </w:rPr>
+        <w:t>potrebi</w:t>
+      </w:r>
+      <w:proofErr w:type="spellEnd"/>
+      <w:r>
+        <w:rPr>
+          <w:rFonts w:ascii="Times New Roman" w:hAnsi="Times New Roman" w:cs="Times New Roman"/>
+          <w:sz w:val="20"/>
+          <w:szCs w:val="22"/>
+        </w:rPr>
+        <w:t xml:space="preserve"> </w:t>
+      </w:r>
+      <w:proofErr w:type="spellStart"/>
+      <w:r>
+        <w:rPr>
+          <w:rFonts w:ascii="Times New Roman" w:hAnsi="Times New Roman" w:cs="Times New Roman"/>
+          <w:sz w:val="20"/>
+          <w:szCs w:val="22"/>
+        </w:rPr>
+        <w:t>blokira</w:t>
+      </w:r>
+      <w:proofErr w:type="spellEnd"/>
+      <w:r>
+        <w:rPr>
+          <w:rFonts w:ascii="Times New Roman" w:hAnsi="Times New Roman" w:cs="Times New Roman"/>
+          <w:sz w:val="20"/>
+          <w:szCs w:val="22"/>
+        </w:rPr>
+        <w:t xml:space="preserve"> </w:t>
+      </w:r>
+      <w:proofErr w:type="spellStart"/>
+      <w:r>
+        <w:rPr>
+          <w:rFonts w:ascii="Times New Roman" w:hAnsi="Times New Roman" w:cs="Times New Roman"/>
+          <w:sz w:val="20"/>
+          <w:szCs w:val="22"/>
+        </w:rPr>
+        <w:t>nalog</w:t>
+      </w:r>
+      <w:proofErr w:type="spellEnd"/>
+      <w:r>
+        <w:rPr>
+          <w:rFonts w:ascii="Times New Roman" w:hAnsi="Times New Roman" w:cs="Times New Roman"/>
+          <w:sz w:val="20"/>
+          <w:szCs w:val="22"/>
+        </w:rPr>
+        <w:t xml:space="preserve"> </w:t>
+      </w:r>
+      <w:proofErr w:type="spellStart"/>
+      <w:r>
+        <w:rPr>
+          <w:rFonts w:ascii="Times New Roman" w:hAnsi="Times New Roman" w:cs="Times New Roman"/>
+          <w:sz w:val="20"/>
+          <w:szCs w:val="22"/>
+        </w:rPr>
+        <w:t>nakon</w:t>
+      </w:r>
+      <w:proofErr w:type="spellEnd"/>
+      <w:r>
+        <w:rPr>
+          <w:rFonts w:ascii="Times New Roman" w:hAnsi="Times New Roman" w:cs="Times New Roman"/>
+          <w:sz w:val="20"/>
+          <w:szCs w:val="22"/>
+        </w:rPr>
+        <w:t xml:space="preserve"> </w:t>
+      </w:r>
+      <w:proofErr w:type="spellStart"/>
+      <w:r>
+        <w:rPr>
+          <w:rFonts w:ascii="Times New Roman" w:hAnsi="Times New Roman" w:cs="Times New Roman"/>
+          <w:sz w:val="20"/>
+          <w:szCs w:val="22"/>
+        </w:rPr>
+        <w:t>određenog</w:t>
+      </w:r>
+      <w:proofErr w:type="spellEnd"/>
+      <w:r>
+        <w:rPr>
+          <w:rFonts w:ascii="Times New Roman" w:hAnsi="Times New Roman" w:cs="Times New Roman"/>
+          <w:sz w:val="20"/>
+          <w:szCs w:val="22"/>
+        </w:rPr>
+        <w:t xml:space="preserve"> </w:t>
+      </w:r>
+      <w:proofErr w:type="spellStart"/>
+      <w:r>
+        <w:rPr>
+          <w:rFonts w:ascii="Times New Roman" w:hAnsi="Times New Roman" w:cs="Times New Roman"/>
+          <w:sz w:val="20"/>
+          <w:szCs w:val="22"/>
+        </w:rPr>
+        <w:t>broja</w:t>
+      </w:r>
+      <w:proofErr w:type="spellEnd"/>
+      <w:r>
+        <w:rPr>
+          <w:rFonts w:ascii="Times New Roman" w:hAnsi="Times New Roman" w:cs="Times New Roman"/>
+          <w:sz w:val="20"/>
+          <w:szCs w:val="22"/>
+        </w:rPr>
+        <w:t xml:space="preserve"> </w:t>
+      </w:r>
+      <w:proofErr w:type="spellStart"/>
+      <w:r>
+        <w:rPr>
+          <w:rFonts w:ascii="Times New Roman" w:hAnsi="Times New Roman" w:cs="Times New Roman"/>
+          <w:sz w:val="20"/>
+          <w:szCs w:val="22"/>
+        </w:rPr>
+        <w:t>neuspeha</w:t>
+      </w:r>
+      <w:proofErr w:type="spellEnd"/>
+      <w:r>
         <w:t>.</w:t>
       </w:r>
     </w:p>
     <w:p>
       <w:pPr>
-        <w:pStyle w:val="ListParagraph"/>
-        <w:numPr>
-          <w:ilvl w:val="0"/>
-          <w:numId w:val="13"/>
-        </w:numPr>
-        <w:spacing w:after="0" w:line="319" w:lineRule="auto"/>
-        <w:ind w:right="4087"/>
-        <w:rPr>
-          <w:rFonts w:ascii="Times New Roman" w:eastAsia="Times New Roman" w:hAnsi="Times New Roman" w:cs="Times New Roman"/>
-          <w:sz w:val="20"/>
-        </w:rPr>
-      </w:pPr>
-      <w:r>
-        <w:rPr>
-          <w:rFonts w:ascii="Times New Roman" w:eastAsia="Times New Roman" w:hAnsi="Times New Roman" w:cs="Times New Roman"/>
-          <w:sz w:val="20"/>
-        </w:rPr>
-        <w:t xml:space="preserve">U </w:t>
-      </w:r>
-      <w:proofErr w:type="spellStart"/>
-      <w:r>
-        <w:rPr>
-          <w:rFonts w:ascii="Times New Roman" w:eastAsia="Times New Roman" w:hAnsi="Times New Roman" w:cs="Times New Roman"/>
-          <w:sz w:val="20"/>
-        </w:rPr>
-        <w:t>slučaju</w:t>
-      </w:r>
-      <w:proofErr w:type="spellEnd"/>
-      <w:r>
-        <w:rPr>
-          <w:rFonts w:ascii="Times New Roman" w:eastAsia="Times New Roman" w:hAnsi="Times New Roman" w:cs="Times New Roman"/>
-          <w:sz w:val="20"/>
-        </w:rPr>
-        <w:t xml:space="preserve"> </w:t>
-      </w:r>
-      <w:proofErr w:type="spellStart"/>
-      <w:r>
-        <w:rPr>
-          <w:rFonts w:ascii="Times New Roman" w:eastAsia="Times New Roman" w:hAnsi="Times New Roman" w:cs="Times New Roman"/>
-          <w:sz w:val="20"/>
-        </w:rPr>
-        <w:t>neuspešne</w:t>
-      </w:r>
-      <w:proofErr w:type="spellEnd"/>
-      <w:r>
-        <w:rPr>
-          <w:rFonts w:ascii="Times New Roman" w:eastAsia="Times New Roman" w:hAnsi="Times New Roman" w:cs="Times New Roman"/>
-          <w:sz w:val="20"/>
-        </w:rPr>
-        <w:t xml:space="preserve"> </w:t>
-      </w:r>
-      <w:proofErr w:type="spellStart"/>
-      <w:r>
-        <w:rPr>
-          <w:rFonts w:ascii="Times New Roman" w:eastAsia="Times New Roman" w:hAnsi="Times New Roman" w:cs="Times New Roman"/>
-          <w:sz w:val="20"/>
-        </w:rPr>
-        <w:t>prijave</w:t>
-      </w:r>
-      <w:proofErr w:type="spellEnd"/>
-      <w:r>
-        <w:rPr>
-          <w:rFonts w:ascii="Times New Roman" w:eastAsia="Times New Roman" w:hAnsi="Times New Roman" w:cs="Times New Roman"/>
-          <w:sz w:val="20"/>
-        </w:rPr>
-        <w:t xml:space="preserve">, </w:t>
-      </w:r>
-      <w:proofErr w:type="spellStart"/>
-      <w:r>
-        <w:rPr>
-          <w:rFonts w:ascii="Times New Roman" w:eastAsia="Times New Roman" w:hAnsi="Times New Roman" w:cs="Times New Roman"/>
-          <w:sz w:val="20"/>
-        </w:rPr>
-        <w:t>sistem</w:t>
-      </w:r>
-      <w:proofErr w:type="spellEnd"/>
-      <w:r>
-        <w:rPr>
-          <w:rFonts w:ascii="Times New Roman" w:eastAsia="Times New Roman" w:hAnsi="Times New Roman" w:cs="Times New Roman"/>
-          <w:sz w:val="20"/>
-        </w:rPr>
-        <w:t xml:space="preserve"> </w:t>
-      </w:r>
-      <w:proofErr w:type="spellStart"/>
-      <w:r>
-        <w:rPr>
-          <w:rFonts w:ascii="Times New Roman" w:eastAsia="Times New Roman" w:hAnsi="Times New Roman" w:cs="Times New Roman"/>
-          <w:sz w:val="20"/>
-        </w:rPr>
-        <w:t>beleži</w:t>
-      </w:r>
-      <w:proofErr w:type="spellEnd"/>
-      <w:r>
-        <w:rPr>
-          <w:rFonts w:ascii="Times New Roman" w:eastAsia="Times New Roman" w:hAnsi="Times New Roman" w:cs="Times New Roman"/>
-          <w:sz w:val="20"/>
-        </w:rPr>
-        <w:t xml:space="preserve"> </w:t>
-      </w:r>
-      <w:proofErr w:type="spellStart"/>
-      <w:r>
-        <w:rPr>
-          <w:rFonts w:ascii="Times New Roman" w:eastAsia="Times New Roman" w:hAnsi="Times New Roman" w:cs="Times New Roman"/>
-          <w:sz w:val="20"/>
-        </w:rPr>
-        <w:t>pokušaj</w:t>
-      </w:r>
-      <w:proofErr w:type="spellEnd"/>
-      <w:r>
-        <w:rPr>
-          <w:rFonts w:ascii="Times New Roman" w:eastAsia="Times New Roman" w:hAnsi="Times New Roman" w:cs="Times New Roman"/>
-          <w:sz w:val="20"/>
-        </w:rPr>
-        <w:t xml:space="preserve"> </w:t>
-      </w:r>
-      <w:proofErr w:type="spellStart"/>
-      <w:r>
-        <w:rPr>
-          <w:rFonts w:ascii="Times New Roman" w:eastAsia="Times New Roman" w:hAnsi="Times New Roman" w:cs="Times New Roman"/>
-          <w:sz w:val="20"/>
-        </w:rPr>
-        <w:t>i</w:t>
-      </w:r>
-      <w:proofErr w:type="spellEnd"/>
-      <w:r>
-        <w:rPr>
-          <w:rFonts w:ascii="Times New Roman" w:eastAsia="Times New Roman" w:hAnsi="Times New Roman" w:cs="Times New Roman"/>
-          <w:sz w:val="20"/>
-        </w:rPr>
-        <w:t xml:space="preserve"> po </w:t>
-      </w:r>
-      <w:proofErr w:type="spellStart"/>
-      <w:r>
-        <w:rPr>
-          <w:rFonts w:ascii="Times New Roman" w:eastAsia="Times New Roman" w:hAnsi="Times New Roman" w:cs="Times New Roman"/>
-          <w:sz w:val="20"/>
-        </w:rPr>
-        <w:t>potrebi</w:t>
-      </w:r>
-      <w:proofErr w:type="spellEnd"/>
-      <w:r>
-        <w:rPr>
-          <w:rFonts w:ascii="Times New Roman" w:eastAsia="Times New Roman" w:hAnsi="Times New Roman" w:cs="Times New Roman"/>
-          <w:sz w:val="20"/>
-        </w:rPr>
-        <w:t xml:space="preserve"> </w:t>
-      </w:r>
-      <w:proofErr w:type="spellStart"/>
-      <w:r>
-        <w:rPr>
-          <w:rFonts w:ascii="Times New Roman" w:eastAsia="Times New Roman" w:hAnsi="Times New Roman" w:cs="Times New Roman"/>
-          <w:sz w:val="20"/>
-        </w:rPr>
-        <w:t>blokira</w:t>
-      </w:r>
-      <w:proofErr w:type="spellEnd"/>
-      <w:r>
-        <w:rPr>
-          <w:rFonts w:ascii="Times New Roman" w:eastAsia="Times New Roman" w:hAnsi="Times New Roman" w:cs="Times New Roman"/>
-          <w:sz w:val="20"/>
-        </w:rPr>
-        <w:t xml:space="preserve"> </w:t>
-      </w:r>
-      <w:proofErr w:type="spellStart"/>
-      <w:r>
-        <w:rPr>
-          <w:rFonts w:ascii="Times New Roman" w:eastAsia="Times New Roman" w:hAnsi="Times New Roman" w:cs="Times New Roman"/>
-          <w:sz w:val="20"/>
-        </w:rPr>
-        <w:t>nalog</w:t>
-      </w:r>
-      <w:proofErr w:type="spellEnd"/>
-      <w:r>
-        <w:rPr>
-          <w:rFonts w:ascii="Times New Roman" w:eastAsia="Times New Roman" w:hAnsi="Times New Roman" w:cs="Times New Roman"/>
-          <w:sz w:val="20"/>
-        </w:rPr>
-        <w:t xml:space="preserve"> </w:t>
-      </w:r>
-      <w:proofErr w:type="spellStart"/>
-      <w:r>
-        <w:rPr>
-          <w:rFonts w:ascii="Times New Roman" w:eastAsia="Times New Roman" w:hAnsi="Times New Roman" w:cs="Times New Roman"/>
-          <w:sz w:val="20"/>
-        </w:rPr>
-        <w:t>nakon</w:t>
-      </w:r>
-      <w:proofErr w:type="spellEnd"/>
-      <w:r>
-        <w:rPr>
-          <w:rFonts w:ascii="Times New Roman" w:eastAsia="Times New Roman" w:hAnsi="Times New Roman" w:cs="Times New Roman"/>
-          <w:sz w:val="20"/>
-        </w:rPr>
-        <w:t xml:space="preserve"> </w:t>
-      </w:r>
-      <w:proofErr w:type="spellStart"/>
-      <w:r>
-        <w:rPr>
-          <w:rFonts w:ascii="Times New Roman" w:eastAsia="Times New Roman" w:hAnsi="Times New Roman" w:cs="Times New Roman"/>
-          <w:sz w:val="20"/>
-        </w:rPr>
-        <w:t>određenog</w:t>
-      </w:r>
-      <w:proofErr w:type="spellEnd"/>
-      <w:r>
-        <w:rPr>
-          <w:rFonts w:ascii="Times New Roman" w:eastAsia="Times New Roman" w:hAnsi="Times New Roman" w:cs="Times New Roman"/>
-          <w:sz w:val="20"/>
-        </w:rPr>
-        <w:t xml:space="preserve"> </w:t>
-      </w:r>
-      <w:proofErr w:type="spellStart"/>
-      <w:r>
-        <w:rPr>
-          <w:rFonts w:ascii="Times New Roman" w:eastAsia="Times New Roman" w:hAnsi="Times New Roman" w:cs="Times New Roman"/>
-          <w:sz w:val="20"/>
-        </w:rPr>
-        <w:t>broja</w:t>
-      </w:r>
-      <w:proofErr w:type="spellEnd"/>
-      <w:r>
-        <w:rPr>
-          <w:rFonts w:ascii="Times New Roman" w:eastAsia="Times New Roman" w:hAnsi="Times New Roman" w:cs="Times New Roman"/>
-          <w:sz w:val="20"/>
-        </w:rPr>
-        <w:t xml:space="preserve"> </w:t>
-      </w:r>
-      <w:proofErr w:type="spellStart"/>
-      <w:r>
-        <w:rPr>
-          <w:rFonts w:ascii="Times New Roman" w:eastAsia="Times New Roman" w:hAnsi="Times New Roman" w:cs="Times New Roman"/>
-          <w:sz w:val="20"/>
-        </w:rPr>
-        <w:t>neuspeha</w:t>
-      </w:r>
-      <w:proofErr w:type="spellEnd"/>
-      <w:r>
-        <w:rPr>
-          <w:rFonts w:ascii="Times New Roman" w:eastAsia="Times New Roman" w:hAnsi="Times New Roman" w:cs="Times New Roman"/>
-          <w:sz w:val="20"/>
-        </w:rPr>
-        <w:t>.</w:t>
-      </w:r>
-    </w:p>
-    <w:p>
-      <w:pPr>
         <w:spacing w:after="0"/>
         <w:ind w:left="720"/>
       </w:pPr>
@@ -8748,12 +8890,12 @@
       </w:r>
     </w:p>
     <w:sectPr>
-      <w:headerReference w:type="even" r:id="rId13"/>
-      <w:headerReference w:type="default" r:id="rId14"/>
-      <w:footerReference w:type="even" r:id="rId15"/>
-      <w:footerReference w:type="default" r:id="rId16"/>
-      <w:headerReference w:type="first" r:id="rId17"/>
-      <w:footerReference w:type="first" r:id="rId18"/>
+      <w:headerReference w:type="even" r:id="rId8"/>
+      <w:headerReference w:type="default" r:id="rId9"/>
+      <w:footerReference w:type="even" r:id="rId10"/>
+      <w:footerReference w:type="default" r:id="rId11"/>
+      <w:headerReference w:type="first" r:id="rId12"/>
+      <w:footerReference w:type="first" r:id="rId13"/>
       <w:pgSz w:w="12240" w:h="15840"/>
       <w:pgMar w:top="1443" w:right="538" w:bottom="1652" w:left="1798" w:header="720" w:footer="720" w:gutter="0"/>
       <w:cols w:space="720"/>
@@ -8790,24 +8932,6 @@
 
 <file path=word/footer1.xml><?xml version="1.0" encoding="utf-8"?>
 <w:ftr xmlns:wpc="http://schemas.microsoft.com/office/word/2010/wordprocessingCanvas" xmlns:cx="http://schemas.microsoft.com/office/drawing/2014/chartex" xmlns:cx1="http://schemas.microsoft.com/office/drawing/2015/9/8/chartex" xmlns:cx2="http://schemas.microsoft.com/office/drawing/2015/10/21/chartex" xmlns:cx3="http://schemas.microsoft.com/office/drawing/2016/5/9/chartex" xmlns:cx4="http://schemas.microsoft.com/office/drawing/2016/5/10/chartex" xmlns:cx5="http://schemas.microsoft.com/office/drawing/2016/5/11/chartex" xmlns:cx6="http://schemas.microsoft.com/office/drawing/2016/5/12/chartex" xmlns:cx7="http://schemas.microsoft.com/office/drawing/2016/5/13/chartex" xmlns:cx8="http://schemas.microsoft.com/office/drawing/2016/5/14/chartex" xmlns:mc="http://schemas.openxmlformats.org/markup-compatibility/2006" xmlns:aink="http://schemas.microsoft.com/office/drawing/2016/ink" xmlns:am3d="http://schemas.microsoft.com/office/drawing/2017/model3d" xmlns:o="urn:schemas-microsoft-com:office:office" xmlns:oel="http://schemas.microsoft.com/office/2019/extlst" xmlns:r="http://schemas.openxmlformats.org/officeDocument/2006/relationships" xmlns:m="http://schemas.openxmlformats.org/officeDocument/2006/math" xmlns:v="urn:schemas-microsoft-com:vml" xmlns:wp14="http://schemas.microsoft.com/office/word/2010/wordprocessingDrawing" xmlns:wp="http://schemas.openxmlformats.org/drawingml/2006/wordprocessingDrawing" xmlns:w10="urn:schemas-microsoft-com:office:word" xmlns:w="http://schemas.openxmlformats.org/wordprocessingml/2006/main" xmlns:w14="http://schemas.microsoft.com/office/word/2010/wordml" xmlns:w15="http://schemas.microsoft.com/office/word/2012/wordml" xmlns:w16cex="http://schemas.microsoft.com/office/word/2018/wordml/cex" xmlns:w16cid="http://schemas.microsoft.com/office/word/2016/wordml/cid" xmlns:w16="http://schemas.microsoft.com/office/word/2018/wordml" xmlns:w16du="http://schemas.microsoft.com/office/word/2023/wordml/word16du" xmlns:w16sdtdh="http://schemas.microsoft.com/office/word/2020/wordml/sdtdatahash" xmlns:w16sdtfl="http://schemas.microsoft.com/office/word/2024/wordml/sdtformatlock" xmlns:w16se="http://schemas.microsoft.com/office/word/2015/wordml/symex" xmlns:wpg="http://schemas.microsoft.com/office/word/2010/wordprocessingGroup" xmlns:wpi="http://schemas.microsoft.com/office/word/2010/wordprocessingInk" xmlns:wne="http://schemas.microsoft.com/office/word/2006/wordml" xmlns:wps="http://schemas.microsoft.com/office/word/2010/wordprocessingShape" mc:Ignorable="w14 w15 w16se w16cid w16 w16cex w16sdtdh w16sdtfl w16du wp14">
-  <w:p/>
-</w:ftr>
-</file>
-
-<file path=word/footer2.xml><?xml version="1.0" encoding="utf-8"?>
-<w:ftr xmlns:wpc="http://schemas.microsoft.com/office/word/2010/wordprocessingCanvas" xmlns:cx="http://schemas.microsoft.com/office/drawing/2014/chartex" xmlns:cx1="http://schemas.microsoft.com/office/drawing/2015/9/8/chartex" xmlns:cx2="http://schemas.microsoft.com/office/drawing/2015/10/21/chartex" xmlns:cx3="http://schemas.microsoft.com/office/drawing/2016/5/9/chartex" xmlns:cx4="http://schemas.microsoft.com/office/drawing/2016/5/10/chartex" xmlns:cx5="http://schemas.microsoft.com/office/drawing/2016/5/11/chartex" xmlns:cx6="http://schemas.microsoft.com/office/drawing/2016/5/12/chartex" xmlns:cx7="http://schemas.microsoft.com/office/drawing/2016/5/13/chartex" xmlns:cx8="http://schemas.microsoft.com/office/drawing/2016/5/14/chartex" xmlns:mc="http://schemas.openxmlformats.org/markup-compatibility/2006" xmlns:aink="http://schemas.microsoft.com/office/drawing/2016/ink" xmlns:am3d="http://schemas.microsoft.com/office/drawing/2017/model3d" xmlns:o="urn:schemas-microsoft-com:office:office" xmlns:oel="http://schemas.microsoft.com/office/2019/extlst" xmlns:r="http://schemas.openxmlformats.org/officeDocument/2006/relationships" xmlns:m="http://schemas.openxmlformats.org/officeDocument/2006/math" xmlns:v="urn:schemas-microsoft-com:vml" xmlns:wp14="http://schemas.microsoft.com/office/word/2010/wordprocessingDrawing" xmlns:wp="http://schemas.openxmlformats.org/drawingml/2006/wordprocessingDrawing" xmlns:w10="urn:schemas-microsoft-com:office:word" xmlns:w="http://schemas.openxmlformats.org/wordprocessingml/2006/main" xmlns:w14="http://schemas.microsoft.com/office/word/2010/wordml" xmlns:w15="http://schemas.microsoft.com/office/word/2012/wordml" xmlns:w16cex="http://schemas.microsoft.com/office/word/2018/wordml/cex" xmlns:w16cid="http://schemas.microsoft.com/office/word/2016/wordml/cid" xmlns:w16="http://schemas.microsoft.com/office/word/2018/wordml" xmlns:w16du="http://schemas.microsoft.com/office/word/2023/wordml/word16du" xmlns:w16sdtdh="http://schemas.microsoft.com/office/word/2020/wordml/sdtdatahash" xmlns:w16sdtfl="http://schemas.microsoft.com/office/word/2024/wordml/sdtformatlock" xmlns:w16se="http://schemas.microsoft.com/office/word/2015/wordml/symex" xmlns:wpg="http://schemas.microsoft.com/office/word/2010/wordprocessingGroup" xmlns:wpi="http://schemas.microsoft.com/office/word/2010/wordprocessingInk" xmlns:wne="http://schemas.microsoft.com/office/word/2006/wordml" xmlns:wps="http://schemas.microsoft.com/office/word/2010/wordprocessingShape" mc:Ignorable="w14 w15 w16se w16cid w16 w16cex w16sdtdh w16sdtfl w16du wp14">
-  <w:p/>
-</w:ftr>
-</file>
-
-<file path=word/footer3.xml><?xml version="1.0" encoding="utf-8"?>
-<w:ftr xmlns:wpc="http://schemas.microsoft.com/office/word/2010/wordprocessingCanvas" xmlns:cx="http://schemas.microsoft.com/office/drawing/2014/chartex" xmlns:cx1="http://schemas.microsoft.com/office/drawing/2015/9/8/chartex" xmlns:cx2="http://schemas.microsoft.com/office/drawing/2015/10/21/chartex" xmlns:cx3="http://schemas.microsoft.com/office/drawing/2016/5/9/chartex" xmlns:cx4="http://schemas.microsoft.com/office/drawing/2016/5/10/chartex" xmlns:cx5="http://schemas.microsoft.com/office/drawing/2016/5/11/chartex" xmlns:cx6="http://schemas.microsoft.com/office/drawing/2016/5/12/chartex" xmlns:cx7="http://schemas.microsoft.com/office/drawing/2016/5/13/chartex" xmlns:cx8="http://schemas.microsoft.com/office/drawing/2016/5/14/chartex" xmlns:mc="http://schemas.openxmlformats.org/markup-compatibility/2006" xmlns:aink="http://schemas.microsoft.com/office/drawing/2016/ink" xmlns:am3d="http://schemas.microsoft.com/office/drawing/2017/model3d" xmlns:o="urn:schemas-microsoft-com:office:office" xmlns:oel="http://schemas.microsoft.com/office/2019/extlst" xmlns:r="http://schemas.openxmlformats.org/officeDocument/2006/relationships" xmlns:m="http://schemas.openxmlformats.org/officeDocument/2006/math" xmlns:v="urn:schemas-microsoft-com:vml" xmlns:wp14="http://schemas.microsoft.com/office/word/2010/wordprocessingDrawing" xmlns:wp="http://schemas.openxmlformats.org/drawingml/2006/wordprocessingDrawing" xmlns:w10="urn:schemas-microsoft-com:office:word" xmlns:w="http://schemas.openxmlformats.org/wordprocessingml/2006/main" xmlns:w14="http://schemas.microsoft.com/office/word/2010/wordml" xmlns:w15="http://schemas.microsoft.com/office/word/2012/wordml" xmlns:w16cex="http://schemas.microsoft.com/office/word/2018/wordml/cex" xmlns:w16cid="http://schemas.microsoft.com/office/word/2016/wordml/cid" xmlns:w16="http://schemas.microsoft.com/office/word/2018/wordml" xmlns:w16du="http://schemas.microsoft.com/office/word/2023/wordml/word16du" xmlns:w16sdtdh="http://schemas.microsoft.com/office/word/2020/wordml/sdtdatahash" xmlns:w16sdtfl="http://schemas.microsoft.com/office/word/2024/wordml/sdtformatlock" xmlns:w16se="http://schemas.microsoft.com/office/word/2015/wordml/symex" xmlns:wpg="http://schemas.microsoft.com/office/word/2010/wordprocessingGroup" xmlns:wpi="http://schemas.microsoft.com/office/word/2010/wordprocessingInk" xmlns:wne="http://schemas.microsoft.com/office/word/2006/wordml" xmlns:wps="http://schemas.microsoft.com/office/word/2010/wordprocessingShape" mc:Ignorable="w14 w15 w16se w16cid w16 w16cex w16sdtdh w16sdtfl w16du wp14">
-  <w:p/>
-</w:ftr>
-</file>
-
-<file path=word/footer4.xml><?xml version="1.0" encoding="utf-8"?>
-<w:ftr xmlns:wpc="http://schemas.microsoft.com/office/word/2010/wordprocessingCanvas" xmlns:cx="http://schemas.microsoft.com/office/drawing/2014/chartex" xmlns:cx1="http://schemas.microsoft.com/office/drawing/2015/9/8/chartex" xmlns:cx2="http://schemas.microsoft.com/office/drawing/2015/10/21/chartex" xmlns:cx3="http://schemas.microsoft.com/office/drawing/2016/5/9/chartex" xmlns:cx4="http://schemas.microsoft.com/office/drawing/2016/5/10/chartex" xmlns:cx5="http://schemas.microsoft.com/office/drawing/2016/5/11/chartex" xmlns:cx6="http://schemas.microsoft.com/office/drawing/2016/5/12/chartex" xmlns:cx7="http://schemas.microsoft.com/office/drawing/2016/5/13/chartex" xmlns:cx8="http://schemas.microsoft.com/office/drawing/2016/5/14/chartex" xmlns:mc="http://schemas.openxmlformats.org/markup-compatibility/2006" xmlns:aink="http://schemas.microsoft.com/office/drawing/2016/ink" xmlns:am3d="http://schemas.microsoft.com/office/drawing/2017/model3d" xmlns:o="urn:schemas-microsoft-com:office:office" xmlns:oel="http://schemas.microsoft.com/office/2019/extlst" xmlns:r="http://schemas.openxmlformats.org/officeDocument/2006/relationships" xmlns:m="http://schemas.openxmlformats.org/officeDocument/2006/math" xmlns:v="urn:schemas-microsoft-com:vml" xmlns:wp14="http://schemas.microsoft.com/office/word/2010/wordprocessingDrawing" xmlns:wp="http://schemas.openxmlformats.org/drawingml/2006/wordprocessingDrawing" xmlns:w10="urn:schemas-microsoft-com:office:word" xmlns:w="http://schemas.openxmlformats.org/wordprocessingml/2006/main" xmlns:w14="http://schemas.microsoft.com/office/word/2010/wordml" xmlns:w15="http://schemas.microsoft.com/office/word/2012/wordml" xmlns:w16cex="http://schemas.microsoft.com/office/word/2018/wordml/cex" xmlns:w16cid="http://schemas.microsoft.com/office/word/2016/wordml/cid" xmlns:w16="http://schemas.microsoft.com/office/word/2018/wordml" xmlns:w16du="http://schemas.microsoft.com/office/word/2023/wordml/word16du" xmlns:w16sdtdh="http://schemas.microsoft.com/office/word/2020/wordml/sdtdatahash" xmlns:w16sdtfl="http://schemas.microsoft.com/office/word/2024/wordml/sdtformatlock" xmlns:w16se="http://schemas.microsoft.com/office/word/2015/wordml/symex" xmlns:wpg="http://schemas.microsoft.com/office/word/2010/wordprocessingGroup" xmlns:wpi="http://schemas.microsoft.com/office/word/2010/wordprocessingInk" xmlns:wne="http://schemas.microsoft.com/office/word/2006/wordml" xmlns:wps="http://schemas.microsoft.com/office/word/2010/wordprocessingShape" mc:Ignorable="w14 w15 w16se w16cid w16 w16cex w16sdtdh w16sdtfl w16du wp14">
   <w:p>
     <w:pPr>
       <w:tabs>
@@ -8872,7 +8996,7 @@
 </w:ftr>
 </file>
 
-<file path=word/footer5.xml><?xml version="1.0" encoding="utf-8"?>
+<file path=word/footer2.xml><?xml version="1.0" encoding="utf-8"?>
 <w:ftr xmlns:wpc="http://schemas.microsoft.com/office/word/2010/wordprocessingCanvas" xmlns:cx="http://schemas.microsoft.com/office/drawing/2014/chartex" xmlns:cx1="http://schemas.microsoft.com/office/drawing/2015/9/8/chartex" xmlns:cx2="http://schemas.microsoft.com/office/drawing/2015/10/21/chartex" xmlns:cx3="http://schemas.microsoft.com/office/drawing/2016/5/9/chartex" xmlns:cx4="http://schemas.microsoft.com/office/drawing/2016/5/10/chartex" xmlns:cx5="http://schemas.microsoft.com/office/drawing/2016/5/11/chartex" xmlns:cx6="http://schemas.microsoft.com/office/drawing/2016/5/12/chartex" xmlns:cx7="http://schemas.microsoft.com/office/drawing/2016/5/13/chartex" xmlns:cx8="http://schemas.microsoft.com/office/drawing/2016/5/14/chartex" xmlns:mc="http://schemas.openxmlformats.org/markup-compatibility/2006" xmlns:aink="http://schemas.microsoft.com/office/drawing/2016/ink" xmlns:am3d="http://schemas.microsoft.com/office/drawing/2017/model3d" xmlns:o="urn:schemas-microsoft-com:office:office" xmlns:oel="http://schemas.microsoft.com/office/2019/extlst" xmlns:r="http://schemas.openxmlformats.org/officeDocument/2006/relationships" xmlns:m="http://schemas.openxmlformats.org/officeDocument/2006/math" xmlns:v="urn:schemas-microsoft-com:vml" xmlns:wp14="http://schemas.microsoft.com/office/word/2010/wordprocessingDrawing" xmlns:wp="http://schemas.openxmlformats.org/drawingml/2006/wordprocessingDrawing" xmlns:w10="urn:schemas-microsoft-com:office:word" xmlns:w="http://schemas.openxmlformats.org/wordprocessingml/2006/main" xmlns:w14="http://schemas.microsoft.com/office/word/2010/wordml" xmlns:w15="http://schemas.microsoft.com/office/word/2012/wordml" xmlns:w16cex="http://schemas.microsoft.com/office/word/2018/wordml/cex" xmlns:w16cid="http://schemas.microsoft.com/office/word/2016/wordml/cid" xmlns:w16="http://schemas.microsoft.com/office/word/2018/wordml" xmlns:w16du="http://schemas.microsoft.com/office/word/2023/wordml/word16du" xmlns:w16sdtdh="http://schemas.microsoft.com/office/word/2020/wordml/sdtdatahash" xmlns:w16sdtfl="http://schemas.microsoft.com/office/word/2024/wordml/sdtformatlock" xmlns:w16se="http://schemas.microsoft.com/office/word/2015/wordml/symex" xmlns:wpg="http://schemas.microsoft.com/office/word/2010/wordprocessingGroup" xmlns:wpi="http://schemas.microsoft.com/office/word/2010/wordprocessingInk" xmlns:wne="http://schemas.microsoft.com/office/word/2006/wordml" xmlns:wps="http://schemas.microsoft.com/office/word/2010/wordprocessingShape" mc:Ignorable="w14 w15 w16se w16cid w16 w16cex w16sdtdh w16sdtfl w16du wp14">
   <w:p>
     <w:pPr>
@@ -8938,7 +9062,7 @@
 </w:ftr>
 </file>
 
-<file path=word/footer6.xml><?xml version="1.0" encoding="utf-8"?>
+<file path=word/footer3.xml><?xml version="1.0" encoding="utf-8"?>
 <w:ftr xmlns:wpc="http://schemas.microsoft.com/office/word/2010/wordprocessingCanvas" xmlns:cx="http://schemas.microsoft.com/office/drawing/2014/chartex" xmlns:cx1="http://schemas.microsoft.com/office/drawing/2015/9/8/chartex" xmlns:cx2="http://schemas.microsoft.com/office/drawing/2015/10/21/chartex" xmlns:cx3="http://schemas.microsoft.com/office/drawing/2016/5/9/chartex" xmlns:cx4="http://schemas.microsoft.com/office/drawing/2016/5/10/chartex" xmlns:cx5="http://schemas.microsoft.com/office/drawing/2016/5/11/chartex" xmlns:cx6="http://schemas.microsoft.com/office/drawing/2016/5/12/chartex" xmlns:cx7="http://schemas.microsoft.com/office/drawing/2016/5/13/chartex" xmlns:cx8="http://schemas.microsoft.com/office/drawing/2016/5/14/chartex" xmlns:mc="http://schemas.openxmlformats.org/markup-compatibility/2006" xmlns:aink="http://schemas.microsoft.com/office/drawing/2016/ink" xmlns:am3d="http://schemas.microsoft.com/office/drawing/2017/model3d" xmlns:o="urn:schemas-microsoft-com:office:office" xmlns:oel="http://schemas.microsoft.com/office/2019/extlst" xmlns:r="http://schemas.openxmlformats.org/officeDocument/2006/relationships" xmlns:m="http://schemas.openxmlformats.org/officeDocument/2006/math" xmlns:v="urn:schemas-microsoft-com:vml" xmlns:wp14="http://schemas.microsoft.com/office/word/2010/wordprocessingDrawing" xmlns:wp="http://schemas.openxmlformats.org/drawingml/2006/wordprocessingDrawing" xmlns:w10="urn:schemas-microsoft-com:office:word" xmlns:w="http://schemas.openxmlformats.org/wordprocessingml/2006/main" xmlns:w14="http://schemas.microsoft.com/office/word/2010/wordml" xmlns:w15="http://schemas.microsoft.com/office/word/2012/wordml" xmlns:w16cex="http://schemas.microsoft.com/office/word/2018/wordml/cex" xmlns:w16cid="http://schemas.microsoft.com/office/word/2016/wordml/cid" xmlns:w16="http://schemas.microsoft.com/office/word/2018/wordml" xmlns:w16du="http://schemas.microsoft.com/office/word/2023/wordml/word16du" xmlns:w16sdtdh="http://schemas.microsoft.com/office/word/2020/wordml/sdtdatahash" xmlns:w16sdtfl="http://schemas.microsoft.com/office/word/2024/wordml/sdtformatlock" xmlns:w16se="http://schemas.microsoft.com/office/word/2015/wordml/symex" xmlns:wpg="http://schemas.microsoft.com/office/word/2010/wordprocessingGroup" xmlns:wpi="http://schemas.microsoft.com/office/word/2010/wordprocessingInk" xmlns:wne="http://schemas.microsoft.com/office/word/2006/wordml" xmlns:wps="http://schemas.microsoft.com/office/word/2010/wordprocessingShape" mc:Ignorable="w14 w15 w16se w16cid w16 w16cex w16sdtdh w16sdtfl w16du wp14">
   <w:p/>
 </w:ftr>
@@ -8970,24 +9094,6 @@
 </file>
 
 <file path=word/header1.xml><?xml version="1.0" encoding="utf-8"?>
-<w:hdr xmlns:wpc="http://schemas.microsoft.com/office/word/2010/wordprocessingCanvas" xmlns:cx="http://schemas.microsoft.com/office/drawing/2014/chartex" xmlns:cx1="http://schemas.microsoft.com/office/drawing/2015/9/8/chartex" xmlns:cx2="http://schemas.microsoft.com/office/drawing/2015/10/21/chartex" xmlns:cx3="http://schemas.microsoft.com/office/drawing/2016/5/9/chartex" xmlns:cx4="http://schemas.microsoft.com/office/drawing/2016/5/10/chartex" xmlns:cx5="http://schemas.microsoft.com/office/drawing/2016/5/11/chartex" xmlns:cx6="http://schemas.microsoft.com/office/drawing/2016/5/12/chartex" xmlns:cx7="http://schemas.microsoft.com/office/drawing/2016/5/13/chartex" xmlns:cx8="http://schemas.microsoft.com/office/drawing/2016/5/14/chartex" xmlns:mc="http://schemas.openxmlformats.org/markup-compatibility/2006" xmlns:aink="http://schemas.microsoft.com/office/drawing/2016/ink" xmlns:am3d="http://schemas.microsoft.com/office/drawing/2017/model3d" xmlns:o="urn:schemas-microsoft-com:office:office" xmlns:oel="http://schemas.microsoft.com/office/2019/extlst" xmlns:r="http://schemas.openxmlformats.org/officeDocument/2006/relationships" xmlns:m="http://schemas.openxmlformats.org/officeDocument/2006/math" xmlns:v="urn:schemas-microsoft-com:vml" xmlns:wp14="http://schemas.microsoft.com/office/word/2010/wordprocessingDrawing" xmlns:wp="http://schemas.openxmlformats.org/drawingml/2006/wordprocessingDrawing" xmlns:w10="urn:schemas-microsoft-com:office:word" xmlns:w="http://schemas.openxmlformats.org/wordprocessingml/2006/main" xmlns:w14="http://schemas.microsoft.com/office/word/2010/wordml" xmlns:w15="http://schemas.microsoft.com/office/word/2012/wordml" xmlns:w16cex="http://schemas.microsoft.com/office/word/2018/wordml/cex" xmlns:w16cid="http://schemas.microsoft.com/office/word/2016/wordml/cid" xmlns:w16="http://schemas.microsoft.com/office/word/2018/wordml" xmlns:w16du="http://schemas.microsoft.com/office/word/2023/wordml/word16du" xmlns:w16sdtdh="http://schemas.microsoft.com/office/word/2020/wordml/sdtdatahash" xmlns:w16sdtfl="http://schemas.microsoft.com/office/word/2024/wordml/sdtformatlock" xmlns:w16se="http://schemas.microsoft.com/office/word/2015/wordml/symex" xmlns:wpg="http://schemas.microsoft.com/office/word/2010/wordprocessingGroup" xmlns:wpi="http://schemas.microsoft.com/office/word/2010/wordprocessingInk" xmlns:wne="http://schemas.microsoft.com/office/word/2006/wordml" xmlns:wps="http://schemas.microsoft.com/office/word/2010/wordprocessingShape" mc:Ignorable="w14 w15 w16se w16cid w16 w16cex w16sdtdh w16sdtfl w16du wp14">
-  <w:p/>
-</w:hdr>
-</file>
-
-<file path=word/header2.xml><?xml version="1.0" encoding="utf-8"?>
-<w:hdr xmlns:wpc="http://schemas.microsoft.com/office/word/2010/wordprocessingCanvas" xmlns:cx="http://schemas.microsoft.com/office/drawing/2014/chartex" xmlns:cx1="http://schemas.microsoft.com/office/drawing/2015/9/8/chartex" xmlns:cx2="http://schemas.microsoft.com/office/drawing/2015/10/21/chartex" xmlns:cx3="http://schemas.microsoft.com/office/drawing/2016/5/9/chartex" xmlns:cx4="http://schemas.microsoft.com/office/drawing/2016/5/10/chartex" xmlns:cx5="http://schemas.microsoft.com/office/drawing/2016/5/11/chartex" xmlns:cx6="http://schemas.microsoft.com/office/drawing/2016/5/12/chartex" xmlns:cx7="http://schemas.microsoft.com/office/drawing/2016/5/13/chartex" xmlns:cx8="http://schemas.microsoft.com/office/drawing/2016/5/14/chartex" xmlns:mc="http://schemas.openxmlformats.org/markup-compatibility/2006" xmlns:aink="http://schemas.microsoft.com/office/drawing/2016/ink" xmlns:am3d="http://schemas.microsoft.com/office/drawing/2017/model3d" xmlns:o="urn:schemas-microsoft-com:office:office" xmlns:oel="http://schemas.microsoft.com/office/2019/extlst" xmlns:r="http://schemas.openxmlformats.org/officeDocument/2006/relationships" xmlns:m="http://schemas.openxmlformats.org/officeDocument/2006/math" xmlns:v="urn:schemas-microsoft-com:vml" xmlns:wp14="http://schemas.microsoft.com/office/word/2010/wordprocessingDrawing" xmlns:wp="http://schemas.openxmlformats.org/drawingml/2006/wordprocessingDrawing" xmlns:w10="urn:schemas-microsoft-com:office:word" xmlns:w="http://schemas.openxmlformats.org/wordprocessingml/2006/main" xmlns:w14="http://schemas.microsoft.com/office/word/2010/wordml" xmlns:w15="http://schemas.microsoft.com/office/word/2012/wordml" xmlns:w16cex="http://schemas.microsoft.com/office/word/2018/wordml/cex" xmlns:w16cid="http://schemas.microsoft.com/office/word/2016/wordml/cid" xmlns:w16="http://schemas.microsoft.com/office/word/2018/wordml" xmlns:w16du="http://schemas.microsoft.com/office/word/2023/wordml/word16du" xmlns:w16sdtdh="http://schemas.microsoft.com/office/word/2020/wordml/sdtdatahash" xmlns:w16sdtfl="http://schemas.microsoft.com/office/word/2024/wordml/sdtformatlock" xmlns:w16se="http://schemas.microsoft.com/office/word/2015/wordml/symex" xmlns:wpg="http://schemas.microsoft.com/office/word/2010/wordprocessingGroup" xmlns:wpi="http://schemas.microsoft.com/office/word/2010/wordprocessingInk" xmlns:wne="http://schemas.microsoft.com/office/word/2006/wordml" xmlns:wps="http://schemas.microsoft.com/office/word/2010/wordprocessingShape" mc:Ignorable="w14 w15 w16se w16cid w16 w16cex w16sdtdh w16sdtfl w16du wp14">
-  <w:p/>
-</w:hdr>
-</file>
-
-<file path=word/header3.xml><?xml version="1.0" encoding="utf-8"?>
-<w:hdr xmlns:wpc="http://schemas.microsoft.com/office/word/2010/wordprocessingCanvas" xmlns:cx="http://schemas.microsoft.com/office/drawing/2014/chartex" xmlns:cx1="http://schemas.microsoft.com/office/drawing/2015/9/8/chartex" xmlns:cx2="http://schemas.microsoft.com/office/drawing/2015/10/21/chartex" xmlns:cx3="http://schemas.microsoft.com/office/drawing/2016/5/9/chartex" xmlns:cx4="http://schemas.microsoft.com/office/drawing/2016/5/10/chartex" xmlns:cx5="http://schemas.microsoft.com/office/drawing/2016/5/11/chartex" xmlns:cx6="http://schemas.microsoft.com/office/drawing/2016/5/12/chartex" xmlns:cx7="http://schemas.microsoft.com/office/drawing/2016/5/13/chartex" xmlns:cx8="http://schemas.microsoft.com/office/drawing/2016/5/14/chartex" xmlns:mc="http://schemas.openxmlformats.org/markup-compatibility/2006" xmlns:aink="http://schemas.microsoft.com/office/drawing/2016/ink" xmlns:am3d="http://schemas.microsoft.com/office/drawing/2017/model3d" xmlns:o="urn:schemas-microsoft-com:office:office" xmlns:oel="http://schemas.microsoft.com/office/2019/extlst" xmlns:r="http://schemas.openxmlformats.org/officeDocument/2006/relationships" xmlns:m="http://schemas.openxmlformats.org/officeDocument/2006/math" xmlns:v="urn:schemas-microsoft-com:vml" xmlns:wp14="http://schemas.microsoft.com/office/word/2010/wordprocessingDrawing" xmlns:wp="http://schemas.openxmlformats.org/drawingml/2006/wordprocessingDrawing" xmlns:w10="urn:schemas-microsoft-com:office:word" xmlns:w="http://schemas.openxmlformats.org/wordprocessingml/2006/main" xmlns:w14="http://schemas.microsoft.com/office/word/2010/wordml" xmlns:w15="http://schemas.microsoft.com/office/word/2012/wordml" xmlns:w16cex="http://schemas.microsoft.com/office/word/2018/wordml/cex" xmlns:w16cid="http://schemas.microsoft.com/office/word/2016/wordml/cid" xmlns:w16="http://schemas.microsoft.com/office/word/2018/wordml" xmlns:w16du="http://schemas.microsoft.com/office/word/2023/wordml/word16du" xmlns:w16sdtdh="http://schemas.microsoft.com/office/word/2020/wordml/sdtdatahash" xmlns:w16sdtfl="http://schemas.microsoft.com/office/word/2024/wordml/sdtformatlock" xmlns:w16se="http://schemas.microsoft.com/office/word/2015/wordml/symex" xmlns:wpg="http://schemas.microsoft.com/office/word/2010/wordprocessingGroup" xmlns:wpi="http://schemas.microsoft.com/office/word/2010/wordprocessingInk" xmlns:wne="http://schemas.microsoft.com/office/word/2006/wordml" xmlns:wps="http://schemas.microsoft.com/office/word/2010/wordprocessingShape" mc:Ignorable="w14 w15 w16se w16cid w16 w16cex w16sdtdh w16sdtfl w16du wp14">
-  <w:p/>
-</w:hdr>
-</file>
-
-<file path=word/header4.xml><?xml version="1.0" encoding="utf-8"?>
 <w:hdr xmlns:wpc="http://schemas.microsoft.com/office/word/2010/wordprocessingCanvas" xmlns:cx="http://schemas.microsoft.com/office/drawing/2014/chartex" xmlns:cx1="http://schemas.microsoft.com/office/drawing/2015/9/8/chartex" xmlns:cx2="http://schemas.microsoft.com/office/drawing/2015/10/21/chartex" xmlns:cx3="http://schemas.microsoft.com/office/drawing/2016/5/9/chartex" xmlns:cx4="http://schemas.microsoft.com/office/drawing/2016/5/10/chartex" xmlns:cx5="http://schemas.microsoft.com/office/drawing/2016/5/11/chartex" xmlns:cx6="http://schemas.microsoft.com/office/drawing/2016/5/12/chartex" xmlns:cx7="http://schemas.microsoft.com/office/drawing/2016/5/13/chartex" xmlns:cx8="http://schemas.microsoft.com/office/drawing/2016/5/14/chartex" xmlns:mc="http://schemas.openxmlformats.org/markup-compatibility/2006" xmlns:aink="http://schemas.microsoft.com/office/drawing/2016/ink" xmlns:am3d="http://schemas.microsoft.com/office/drawing/2017/model3d" xmlns:o="urn:schemas-microsoft-com:office:office" xmlns:oel="http://schemas.microsoft.com/office/2019/extlst" xmlns:r="http://schemas.openxmlformats.org/officeDocument/2006/relationships" xmlns:m="http://schemas.openxmlformats.org/officeDocument/2006/math" xmlns:v="urn:schemas-microsoft-com:vml" xmlns:wp14="http://schemas.microsoft.com/office/word/2010/wordprocessingDrawing" xmlns:wp="http://schemas.openxmlformats.org/drawingml/2006/wordprocessingDrawing" xmlns:w10="urn:schemas-microsoft-com:office:word" xmlns:w="http://schemas.openxmlformats.org/wordprocessingml/2006/main" xmlns:w14="http://schemas.microsoft.com/office/word/2010/wordml" xmlns:w15="http://schemas.microsoft.com/office/word/2012/wordml" xmlns:w16cex="http://schemas.microsoft.com/office/word/2018/wordml/cex" xmlns:w16cid="http://schemas.microsoft.com/office/word/2016/wordml/cid" xmlns:w16="http://schemas.microsoft.com/office/word/2018/wordml" xmlns:w16du="http://schemas.microsoft.com/office/word/2023/wordml/word16du" xmlns:w16sdtdh="http://schemas.microsoft.com/office/word/2020/wordml/sdtdatahash" xmlns:w16sdtfl="http://schemas.microsoft.com/office/word/2024/wordml/sdtformatlock" xmlns:w16se="http://schemas.microsoft.com/office/word/2015/wordml/symex" xmlns:wpg="http://schemas.microsoft.com/office/word/2010/wordprocessingGroup" xmlns:wpi="http://schemas.microsoft.com/office/word/2010/wordprocessingInk" xmlns:wne="http://schemas.microsoft.com/office/word/2006/wordml" xmlns:wps="http://schemas.microsoft.com/office/word/2010/wordprocessingShape" mc:Ignorable="w14 w15 w16se w16cid w16 w16cex w16sdtdh w16sdtfl w16du wp14">
   <w:p>
     <w:pPr>
@@ -9067,7 +9173,7 @@
 </w:hdr>
 </file>
 
-<file path=word/header5.xml><?xml version="1.0" encoding="utf-8"?>
+<file path=word/header2.xml><?xml version="1.0" encoding="utf-8"?>
 <w:hdr xmlns:wpc="http://schemas.microsoft.com/office/word/2010/wordprocessingCanvas" xmlns:cx="http://schemas.microsoft.com/office/drawing/2014/chartex" xmlns:cx1="http://schemas.microsoft.com/office/drawing/2015/9/8/chartex" xmlns:cx2="http://schemas.microsoft.com/office/drawing/2015/10/21/chartex" xmlns:cx3="http://schemas.microsoft.com/office/drawing/2016/5/9/chartex" xmlns:cx4="http://schemas.microsoft.com/office/drawing/2016/5/10/chartex" xmlns:cx5="http://schemas.microsoft.com/office/drawing/2016/5/11/chartex" xmlns:cx6="http://schemas.microsoft.com/office/drawing/2016/5/12/chartex" xmlns:cx7="http://schemas.microsoft.com/office/drawing/2016/5/13/chartex" xmlns:cx8="http://schemas.microsoft.com/office/drawing/2016/5/14/chartex" xmlns:mc="http://schemas.openxmlformats.org/markup-compatibility/2006" xmlns:aink="http://schemas.microsoft.com/office/drawing/2016/ink" xmlns:am3d="http://schemas.microsoft.com/office/drawing/2017/model3d" xmlns:o="urn:schemas-microsoft-com:office:office" xmlns:oel="http://schemas.microsoft.com/office/2019/extlst" xmlns:r="http://schemas.openxmlformats.org/officeDocument/2006/relationships" xmlns:m="http://schemas.openxmlformats.org/officeDocument/2006/math" xmlns:v="urn:schemas-microsoft-com:vml" xmlns:wp14="http://schemas.microsoft.com/office/word/2010/wordprocessingDrawing" xmlns:wp="http://schemas.openxmlformats.org/drawingml/2006/wordprocessingDrawing" xmlns:w10="urn:schemas-microsoft-com:office:word" xmlns:w="http://schemas.openxmlformats.org/wordprocessingml/2006/main" xmlns:w14="http://schemas.microsoft.com/office/word/2010/wordml" xmlns:w15="http://schemas.microsoft.com/office/word/2012/wordml" xmlns:w16cex="http://schemas.microsoft.com/office/word/2018/wordml/cex" xmlns:w16cid="http://schemas.microsoft.com/office/word/2016/wordml/cid" xmlns:w16="http://schemas.microsoft.com/office/word/2018/wordml" xmlns:w16du="http://schemas.microsoft.com/office/word/2023/wordml/word16du" xmlns:w16sdtdh="http://schemas.microsoft.com/office/word/2020/wordml/sdtdatahash" xmlns:w16sdtfl="http://schemas.microsoft.com/office/word/2024/wordml/sdtformatlock" xmlns:w16se="http://schemas.microsoft.com/office/word/2015/wordml/symex" xmlns:wpg="http://schemas.microsoft.com/office/word/2010/wordprocessingGroup" xmlns:wpi="http://schemas.microsoft.com/office/word/2010/wordprocessingInk" xmlns:wne="http://schemas.microsoft.com/office/word/2006/wordml" xmlns:wps="http://schemas.microsoft.com/office/word/2010/wordprocessingShape" mc:Ignorable="w14 w15 w16se w16cid w16 w16cex w16sdtdh w16sdtfl w16du wp14">
   <w:p>
     <w:pPr>
@@ -9077,6 +9183,7 @@
       </w:tabs>
       <w:spacing w:after="0"/>
     </w:pPr>
+    <w:proofErr w:type="spellStart"/>
     <w:r>
       <w:rPr>
         <w:rFonts w:ascii="Times New Roman" w:eastAsia="Times New Roman" w:hAnsi="Times New Roman" w:cs="Times New Roman"/>
@@ -9084,7 +9191,17 @@
         <w:sz w:val="20"/>
         <w:u w:val="single" w:color="000000"/>
       </w:rPr>
-      <w:t xml:space="preserve">Surveys </w:t>
+      <w:t>RealArt</w:t>
+    </w:r>
+    <w:proofErr w:type="spellEnd"/>
+    <w:r>
+      <w:rPr>
+        <w:rFonts w:ascii="Times New Roman" w:eastAsia="Times New Roman" w:hAnsi="Times New Roman" w:cs="Times New Roman"/>
+        <w:b/>
+        <w:sz w:val="20"/>
+        <w:u w:val="single" w:color="000000"/>
+      </w:rPr>
+      <w:t xml:space="preserve"> </w:t>
     </w:r>
     <w:r>
       <w:rPr>
@@ -9147,7 +9264,7 @@
 </w:hdr>
 </file>
 
-<file path=word/header6.xml><?xml version="1.0" encoding="utf-8"?>
+<file path=word/header3.xml><?xml version="1.0" encoding="utf-8"?>
 <w:hdr xmlns:wpc="http://schemas.microsoft.com/office/word/2010/wordprocessingCanvas" xmlns:cx="http://schemas.microsoft.com/office/drawing/2014/chartex" xmlns:cx1="http://schemas.microsoft.com/office/drawing/2015/9/8/chartex" xmlns:cx2="http://schemas.microsoft.com/office/drawing/2015/10/21/chartex" xmlns:cx3="http://schemas.microsoft.com/office/drawing/2016/5/9/chartex" xmlns:cx4="http://schemas.microsoft.com/office/drawing/2016/5/10/chartex" xmlns:cx5="http://schemas.microsoft.com/office/drawing/2016/5/11/chartex" xmlns:cx6="http://schemas.microsoft.com/office/drawing/2016/5/12/chartex" xmlns:cx7="http://schemas.microsoft.com/office/drawing/2016/5/13/chartex" xmlns:cx8="http://schemas.microsoft.com/office/drawing/2016/5/14/chartex" xmlns:mc="http://schemas.openxmlformats.org/markup-compatibility/2006" xmlns:aink="http://schemas.microsoft.com/office/drawing/2016/ink" xmlns:am3d="http://schemas.microsoft.com/office/drawing/2017/model3d" xmlns:o="urn:schemas-microsoft-com:office:office" xmlns:oel="http://schemas.microsoft.com/office/2019/extlst" xmlns:r="http://schemas.openxmlformats.org/officeDocument/2006/relationships" xmlns:m="http://schemas.openxmlformats.org/officeDocument/2006/math" xmlns:v="urn:schemas-microsoft-com:vml" xmlns:wp14="http://schemas.microsoft.com/office/word/2010/wordprocessingDrawing" xmlns:wp="http://schemas.openxmlformats.org/drawingml/2006/wordprocessingDrawing" xmlns:w10="urn:schemas-microsoft-com:office:word" xmlns:w="http://schemas.openxmlformats.org/wordprocessingml/2006/main" xmlns:w14="http://schemas.microsoft.com/office/word/2010/wordml" xmlns:w15="http://schemas.microsoft.com/office/word/2012/wordml" xmlns:w16cex="http://schemas.microsoft.com/office/word/2018/wordml/cex" xmlns:w16cid="http://schemas.microsoft.com/office/word/2016/wordml/cid" xmlns:w16="http://schemas.microsoft.com/office/word/2018/wordml" xmlns:w16du="http://schemas.microsoft.com/office/word/2023/wordml/word16du" xmlns:w16sdtdh="http://schemas.microsoft.com/office/word/2020/wordml/sdtdatahash" xmlns:w16sdtfl="http://schemas.microsoft.com/office/word/2024/wordml/sdtformatlock" xmlns:w16se="http://schemas.microsoft.com/office/word/2015/wordml/symex" xmlns:wpg="http://schemas.microsoft.com/office/word/2010/wordprocessingGroup" xmlns:wpi="http://schemas.microsoft.com/office/word/2010/wordprocessingInk" xmlns:wne="http://schemas.microsoft.com/office/word/2006/wordml" xmlns:wps="http://schemas.microsoft.com/office/word/2010/wordprocessingShape" mc:Ignorable="w14 w15 w16se w16cid w16 w16cex w16sdtdh w16sdtfl w16du wp14">
   <w:p/>
 </w:hdr>
@@ -9693,6 +9810,119 @@
     </w:lvl>
   </w:abstractNum>
   <w:abstractNum w:abstractNumId="3" w15:restartNumberingAfterBreak="0">
+    <w:nsid w:val="136E1373"/>
+    <w:multiLevelType w:val="hybridMultilevel"/>
+    <w:tmpl w:val="B2B67B86"/>
+    <w:lvl w:ilvl="0" w:tplc="04090001">
+      <w:start w:val="1"/>
+      <w:numFmt w:val="bullet"/>
+      <w:lvlText w:val=""/>
+      <w:lvlJc w:val="left"/>
+      <w:pPr>
+        <w:ind w:left="360" w:hanging="360"/>
+      </w:pPr>
+      <w:rPr>
+        <w:rFonts w:ascii="Symbol" w:hAnsi="Symbol" w:hint="default"/>
+      </w:rPr>
+    </w:lvl>
+    <w:lvl w:ilvl="1" w:tplc="04090003" w:tentative="1">
+      <w:start w:val="1"/>
+      <w:numFmt w:val="bullet"/>
+      <w:lvlText w:val="o"/>
+      <w:lvlJc w:val="left"/>
+      <w:pPr>
+        <w:ind w:left="1080" w:hanging="360"/>
+      </w:pPr>
+      <w:rPr>
+        <w:rFonts w:ascii="Courier New" w:hAnsi="Courier New" w:cs="Courier New" w:hint="default"/>
+      </w:rPr>
+    </w:lvl>
+    <w:lvl w:ilvl="2" w:tplc="04090005" w:tentative="1">
+      <w:start w:val="1"/>
+      <w:numFmt w:val="bullet"/>
+      <w:lvlText w:val=""/>
+      <w:lvlJc w:val="left"/>
+      <w:pPr>
+        <w:ind w:left="1800" w:hanging="360"/>
+      </w:pPr>
+      <w:rPr>
+        <w:rFonts w:ascii="Wingdings" w:hAnsi="Wingdings" w:hint="default"/>
+      </w:rPr>
+    </w:lvl>
+    <w:lvl w:ilvl="3" w:tplc="04090001" w:tentative="1">
+      <w:start w:val="1"/>
+      <w:numFmt w:val="bullet"/>
+      <w:lvlText w:val=""/>
+      <w:lvlJc w:val="left"/>
+      <w:pPr>
+        <w:ind w:left="2520" w:hanging="360"/>
+      </w:pPr>
+      <w:rPr>
+        <w:rFonts w:ascii="Symbol" w:hAnsi="Symbol" w:hint="default"/>
+      </w:rPr>
+    </w:lvl>
+    <w:lvl w:ilvl="4" w:tplc="04090003" w:tentative="1">
+      <w:start w:val="1"/>
+      <w:numFmt w:val="bullet"/>
+      <w:lvlText w:val="o"/>
+      <w:lvlJc w:val="left"/>
+      <w:pPr>
+        <w:ind w:left="3240" w:hanging="360"/>
+      </w:pPr>
+      <w:rPr>
+        <w:rFonts w:ascii="Courier New" w:hAnsi="Courier New" w:cs="Courier New" w:hint="default"/>
+      </w:rPr>
+    </w:lvl>
+    <w:lvl w:ilvl="5" w:tplc="04090005" w:tentative="1">
+      <w:start w:val="1"/>
+      <w:numFmt w:val="bullet"/>
+      <w:lvlText w:val=""/>
+      <w:lvlJc w:val="left"/>
+      <w:pPr>
+        <w:ind w:left="3960" w:hanging="360"/>
+      </w:pPr>
+      <w:rPr>
+        <w:rFonts w:ascii="Wingdings" w:hAnsi="Wingdings" w:hint="default"/>
+      </w:rPr>
+    </w:lvl>
+    <w:lvl w:ilvl="6" w:tplc="04090001" w:tentative="1">
+      <w:start w:val="1"/>
+      <w:numFmt w:val="bullet"/>
+      <w:lvlText w:val=""/>
+      <w:lvlJc w:val="left"/>
+      <w:pPr>
+        <w:ind w:left="4680" w:hanging="360"/>
+      </w:pPr>
+      <w:rPr>
+        <w:rFonts w:ascii="Symbol" w:hAnsi="Symbol" w:hint="default"/>
+      </w:rPr>
+    </w:lvl>
+    <w:lvl w:ilvl="7" w:tplc="04090003" w:tentative="1">
+      <w:start w:val="1"/>
+      <w:numFmt w:val="bullet"/>
+      <w:lvlText w:val="o"/>
+      <w:lvlJc w:val="left"/>
+      <w:pPr>
+        <w:ind w:left="5400" w:hanging="360"/>
+      </w:pPr>
+      <w:rPr>
+        <w:rFonts w:ascii="Courier New" w:hAnsi="Courier New" w:cs="Courier New" w:hint="default"/>
+      </w:rPr>
+    </w:lvl>
+    <w:lvl w:ilvl="8" w:tplc="04090005" w:tentative="1">
+      <w:start w:val="1"/>
+      <w:numFmt w:val="bullet"/>
+      <w:lvlText w:val=""/>
+      <w:lvlJc w:val="left"/>
+      <w:pPr>
+        <w:ind w:left="6120" w:hanging="360"/>
+      </w:pPr>
+      <w:rPr>
+        <w:rFonts w:ascii="Wingdings" w:hAnsi="Wingdings" w:hint="default"/>
+      </w:rPr>
+    </w:lvl>
+  </w:abstractNum>
+  <w:abstractNum w:abstractNumId="4" w15:restartNumberingAfterBreak="0">
     <w:nsid w:val="14732D16"/>
     <w:multiLevelType w:val="hybridMultilevel"/>
     <w:tmpl w:val="C0F2A1B4"/>
@@ -9904,7 +10134,7 @@
       </w:rPr>
     </w:lvl>
   </w:abstractNum>
-  <w:abstractNum w:abstractNumId="4" w15:restartNumberingAfterBreak="0">
+  <w:abstractNum w:abstractNumId="5" w15:restartNumberingAfterBreak="0">
     <w:nsid w:val="1A893E23"/>
     <w:multiLevelType w:val="hybridMultilevel"/>
     <w:tmpl w:val="2B0A64DA"/>
@@ -9993,7 +10223,7 @@
       </w:pPr>
     </w:lvl>
   </w:abstractNum>
-  <w:abstractNum w:abstractNumId="5" w15:restartNumberingAfterBreak="0">
+  <w:abstractNum w:abstractNumId="6" w15:restartNumberingAfterBreak="0">
     <w:nsid w:val="1CD13A63"/>
     <w:multiLevelType w:val="multilevel"/>
     <w:tmpl w:val="2B2A73F0"/>
@@ -10217,7 +10447,7 @@
       </w:rPr>
     </w:lvl>
   </w:abstractNum>
-  <w:abstractNum w:abstractNumId="6" w15:restartNumberingAfterBreak="0">
+  <w:abstractNum w:abstractNumId="7" w15:restartNumberingAfterBreak="0">
     <w:nsid w:val="27122A4E"/>
     <w:multiLevelType w:val="hybridMultilevel"/>
     <w:tmpl w:val="2D323788"/>
@@ -10306,7 +10536,7 @@
       </w:pPr>
     </w:lvl>
   </w:abstractNum>
-  <w:abstractNum w:abstractNumId="7" w15:restartNumberingAfterBreak="0">
+  <w:abstractNum w:abstractNumId="8" w15:restartNumberingAfterBreak="0">
     <w:nsid w:val="28B44D69"/>
     <w:multiLevelType w:val="hybridMultilevel"/>
     <w:tmpl w:val="F8B60D60"/>
@@ -10395,7 +10625,7 @@
       </w:pPr>
     </w:lvl>
   </w:abstractNum>
-  <w:abstractNum w:abstractNumId="8" w15:restartNumberingAfterBreak="0">
+  <w:abstractNum w:abstractNumId="9" w15:restartNumberingAfterBreak="0">
     <w:nsid w:val="2FCF52E6"/>
     <w:multiLevelType w:val="hybridMultilevel"/>
     <w:tmpl w:val="2970196E"/>
@@ -10607,7 +10837,7 @@
       </w:rPr>
     </w:lvl>
   </w:abstractNum>
-  <w:abstractNum w:abstractNumId="9" w15:restartNumberingAfterBreak="0">
+  <w:abstractNum w:abstractNumId="10" w15:restartNumberingAfterBreak="0">
     <w:nsid w:val="4CBD43C4"/>
     <w:multiLevelType w:val="hybridMultilevel"/>
     <w:tmpl w:val="F496ACBC"/>
@@ -10819,7 +11049,7 @@
       </w:rPr>
     </w:lvl>
   </w:abstractNum>
-  <w:abstractNum w:abstractNumId="10" w15:restartNumberingAfterBreak="0">
+  <w:abstractNum w:abstractNumId="11" w15:restartNumberingAfterBreak="0">
     <w:nsid w:val="59BD6B36"/>
     <w:multiLevelType w:val="hybridMultilevel"/>
     <w:tmpl w:val="DB062C6E"/>
@@ -10932,7 +11162,7 @@
       </w:rPr>
     </w:lvl>
   </w:abstractNum>
-  <w:abstractNum w:abstractNumId="11" w15:restartNumberingAfterBreak="0">
+  <w:abstractNum w:abstractNumId="12" w15:restartNumberingAfterBreak="0">
     <w:nsid w:val="5DB8214A"/>
     <w:multiLevelType w:val="hybridMultilevel"/>
     <w:tmpl w:val="8084AC8E"/>
@@ -11045,7 +11275,7 @@
       </w:rPr>
     </w:lvl>
   </w:abstractNum>
-  <w:abstractNum w:abstractNumId="12" w15:restartNumberingAfterBreak="0">
+  <w:abstractNum w:abstractNumId="13" w15:restartNumberingAfterBreak="0">
     <w:nsid w:val="69676ACF"/>
     <w:multiLevelType w:val="hybridMultilevel"/>
     <w:tmpl w:val="94A2B15C"/>
@@ -11158,14 +11388,240 @@
       </w:rPr>
     </w:lvl>
   </w:abstractNum>
+  <w:abstractNum w:abstractNumId="14" w15:restartNumberingAfterBreak="0">
+    <w:nsid w:val="7BA67405"/>
+    <w:multiLevelType w:val="hybridMultilevel"/>
+    <w:tmpl w:val="50285CB8"/>
+    <w:lvl w:ilvl="0" w:tplc="04090001">
+      <w:start w:val="1"/>
+      <w:numFmt w:val="bullet"/>
+      <w:lvlText w:val=""/>
+      <w:lvlJc w:val="left"/>
+      <w:pPr>
+        <w:ind w:left="360" w:hanging="360"/>
+      </w:pPr>
+      <w:rPr>
+        <w:rFonts w:ascii="Symbol" w:hAnsi="Symbol" w:hint="default"/>
+      </w:rPr>
+    </w:lvl>
+    <w:lvl w:ilvl="1" w:tplc="04090003" w:tentative="1">
+      <w:start w:val="1"/>
+      <w:numFmt w:val="bullet"/>
+      <w:lvlText w:val="o"/>
+      <w:lvlJc w:val="left"/>
+      <w:pPr>
+        <w:ind w:left="1080" w:hanging="360"/>
+      </w:pPr>
+      <w:rPr>
+        <w:rFonts w:ascii="Courier New" w:hAnsi="Courier New" w:cs="Courier New" w:hint="default"/>
+      </w:rPr>
+    </w:lvl>
+    <w:lvl w:ilvl="2" w:tplc="04090005" w:tentative="1">
+      <w:start w:val="1"/>
+      <w:numFmt w:val="bullet"/>
+      <w:lvlText w:val=""/>
+      <w:lvlJc w:val="left"/>
+      <w:pPr>
+        <w:ind w:left="1800" w:hanging="360"/>
+      </w:pPr>
+      <w:rPr>
+        <w:rFonts w:ascii="Wingdings" w:hAnsi="Wingdings" w:hint="default"/>
+      </w:rPr>
+    </w:lvl>
+    <w:lvl w:ilvl="3" w:tplc="04090001" w:tentative="1">
+      <w:start w:val="1"/>
+      <w:numFmt w:val="bullet"/>
+      <w:lvlText w:val=""/>
+      <w:lvlJc w:val="left"/>
+      <w:pPr>
+        <w:ind w:left="2520" w:hanging="360"/>
+      </w:pPr>
+      <w:rPr>
+        <w:rFonts w:ascii="Symbol" w:hAnsi="Symbol" w:hint="default"/>
+      </w:rPr>
+    </w:lvl>
+    <w:lvl w:ilvl="4" w:tplc="04090003" w:tentative="1">
+      <w:start w:val="1"/>
+      <w:numFmt w:val="bullet"/>
+      <w:lvlText w:val="o"/>
+      <w:lvlJc w:val="left"/>
+      <w:pPr>
+        <w:ind w:left="3240" w:hanging="360"/>
+      </w:pPr>
+      <w:rPr>
+        <w:rFonts w:ascii="Courier New" w:hAnsi="Courier New" w:cs="Courier New" w:hint="default"/>
+      </w:rPr>
+    </w:lvl>
+    <w:lvl w:ilvl="5" w:tplc="04090005" w:tentative="1">
+      <w:start w:val="1"/>
+      <w:numFmt w:val="bullet"/>
+      <w:lvlText w:val=""/>
+      <w:lvlJc w:val="left"/>
+      <w:pPr>
+        <w:ind w:left="3960" w:hanging="360"/>
+      </w:pPr>
+      <w:rPr>
+        <w:rFonts w:ascii="Wingdings" w:hAnsi="Wingdings" w:hint="default"/>
+      </w:rPr>
+    </w:lvl>
+    <w:lvl w:ilvl="6" w:tplc="04090001" w:tentative="1">
+      <w:start w:val="1"/>
+      <w:numFmt w:val="bullet"/>
+      <w:lvlText w:val=""/>
+      <w:lvlJc w:val="left"/>
+      <w:pPr>
+        <w:ind w:left="4680" w:hanging="360"/>
+      </w:pPr>
+      <w:rPr>
+        <w:rFonts w:ascii="Symbol" w:hAnsi="Symbol" w:hint="default"/>
+      </w:rPr>
+    </w:lvl>
+    <w:lvl w:ilvl="7" w:tplc="04090003" w:tentative="1">
+      <w:start w:val="1"/>
+      <w:numFmt w:val="bullet"/>
+      <w:lvlText w:val="o"/>
+      <w:lvlJc w:val="left"/>
+      <w:pPr>
+        <w:ind w:left="5400" w:hanging="360"/>
+      </w:pPr>
+      <w:rPr>
+        <w:rFonts w:ascii="Courier New" w:hAnsi="Courier New" w:cs="Courier New" w:hint="default"/>
+      </w:rPr>
+    </w:lvl>
+    <w:lvl w:ilvl="8" w:tplc="04090005" w:tentative="1">
+      <w:start w:val="1"/>
+      <w:numFmt w:val="bullet"/>
+      <w:lvlText w:val=""/>
+      <w:lvlJc w:val="left"/>
+      <w:pPr>
+        <w:ind w:left="6120" w:hanging="360"/>
+      </w:pPr>
+      <w:rPr>
+        <w:rFonts w:ascii="Wingdings" w:hAnsi="Wingdings" w:hint="default"/>
+      </w:rPr>
+    </w:lvl>
+  </w:abstractNum>
+  <w:abstractNum w:abstractNumId="15" w15:restartNumberingAfterBreak="0">
+    <w:nsid w:val="7CD70E0A"/>
+    <w:multiLevelType w:val="hybridMultilevel"/>
+    <w:tmpl w:val="9F24D734"/>
+    <w:lvl w:ilvl="0" w:tplc="04090001">
+      <w:start w:val="1"/>
+      <w:numFmt w:val="bullet"/>
+      <w:lvlText w:val=""/>
+      <w:lvlJc w:val="left"/>
+      <w:pPr>
+        <w:ind w:left="360" w:hanging="360"/>
+      </w:pPr>
+      <w:rPr>
+        <w:rFonts w:ascii="Symbol" w:hAnsi="Symbol" w:hint="default"/>
+      </w:rPr>
+    </w:lvl>
+    <w:lvl w:ilvl="1" w:tplc="04090003" w:tentative="1">
+      <w:start w:val="1"/>
+      <w:numFmt w:val="bullet"/>
+      <w:lvlText w:val="o"/>
+      <w:lvlJc w:val="left"/>
+      <w:pPr>
+        <w:ind w:left="1080" w:hanging="360"/>
+      </w:pPr>
+      <w:rPr>
+        <w:rFonts w:ascii="Courier New" w:hAnsi="Courier New" w:cs="Courier New" w:hint="default"/>
+      </w:rPr>
+    </w:lvl>
+    <w:lvl w:ilvl="2" w:tplc="04090005" w:tentative="1">
+      <w:start w:val="1"/>
+      <w:numFmt w:val="bullet"/>
+      <w:lvlText w:val=""/>
+      <w:lvlJc w:val="left"/>
+      <w:pPr>
+        <w:ind w:left="1800" w:hanging="360"/>
+      </w:pPr>
+      <w:rPr>
+        <w:rFonts w:ascii="Wingdings" w:hAnsi="Wingdings" w:hint="default"/>
+      </w:rPr>
+    </w:lvl>
+    <w:lvl w:ilvl="3" w:tplc="04090001" w:tentative="1">
+      <w:start w:val="1"/>
+      <w:numFmt w:val="bullet"/>
+      <w:lvlText w:val=""/>
+      <w:lvlJc w:val="left"/>
+      <w:pPr>
+        <w:ind w:left="2520" w:hanging="360"/>
+      </w:pPr>
+      <w:rPr>
+        <w:rFonts w:ascii="Symbol" w:hAnsi="Symbol" w:hint="default"/>
+      </w:rPr>
+    </w:lvl>
+    <w:lvl w:ilvl="4" w:tplc="04090003" w:tentative="1">
+      <w:start w:val="1"/>
+      <w:numFmt w:val="bullet"/>
+      <w:lvlText w:val="o"/>
+      <w:lvlJc w:val="left"/>
+      <w:pPr>
+        <w:ind w:left="3240" w:hanging="360"/>
+      </w:pPr>
+      <w:rPr>
+        <w:rFonts w:ascii="Courier New" w:hAnsi="Courier New" w:cs="Courier New" w:hint="default"/>
+      </w:rPr>
+    </w:lvl>
+    <w:lvl w:ilvl="5" w:tplc="04090005" w:tentative="1">
+      <w:start w:val="1"/>
+      <w:numFmt w:val="bullet"/>
+      <w:lvlText w:val=""/>
+      <w:lvlJc w:val="left"/>
+      <w:pPr>
+        <w:ind w:left="3960" w:hanging="360"/>
+      </w:pPr>
+      <w:rPr>
+        <w:rFonts w:ascii="Wingdings" w:hAnsi="Wingdings" w:hint="default"/>
+      </w:rPr>
+    </w:lvl>
+    <w:lvl w:ilvl="6" w:tplc="04090001" w:tentative="1">
+      <w:start w:val="1"/>
+      <w:numFmt w:val="bullet"/>
+      <w:lvlText w:val=""/>
+      <w:lvlJc w:val="left"/>
+      <w:pPr>
+        <w:ind w:left="4680" w:hanging="360"/>
+      </w:pPr>
+      <w:rPr>
+        <w:rFonts w:ascii="Symbol" w:hAnsi="Symbol" w:hint="default"/>
+      </w:rPr>
+    </w:lvl>
+    <w:lvl w:ilvl="7" w:tplc="04090003" w:tentative="1">
+      <w:start w:val="1"/>
+      <w:numFmt w:val="bullet"/>
+      <w:lvlText w:val="o"/>
+      <w:lvlJc w:val="left"/>
+      <w:pPr>
+        <w:ind w:left="5400" w:hanging="360"/>
+      </w:pPr>
+      <w:rPr>
+        <w:rFonts w:ascii="Courier New" w:hAnsi="Courier New" w:cs="Courier New" w:hint="default"/>
+      </w:rPr>
+    </w:lvl>
+    <w:lvl w:ilvl="8" w:tplc="04090005" w:tentative="1">
+      <w:start w:val="1"/>
+      <w:numFmt w:val="bullet"/>
+      <w:lvlText w:val=""/>
+      <w:lvlJc w:val="left"/>
+      <w:pPr>
+        <w:ind w:left="6120" w:hanging="360"/>
+      </w:pPr>
+      <w:rPr>
+        <w:rFonts w:ascii="Wingdings" w:hAnsi="Wingdings" w:hint="default"/>
+      </w:rPr>
+    </w:lvl>
+  </w:abstractNum>
   <w:num w:numId="1" w16cid:durableId="647586566">
-    <w:abstractNumId w:val="3"/>
+    <w:abstractNumId w:val="4"/>
   </w:num>
   <w:num w:numId="2" w16cid:durableId="1409688466">
-    <w:abstractNumId w:val="8"/>
+    <w:abstractNumId w:val="9"/>
   </w:num>
   <w:num w:numId="3" w16cid:durableId="1368486324">
-    <w:abstractNumId w:val="9"/>
+    <w:abstractNumId w:val="10"/>
   </w:num>
   <w:num w:numId="4" w16cid:durableId="1754933419">
     <w:abstractNumId w:val="0"/>
@@ -11174,28 +11630,37 @@
     <w:abstractNumId w:val="2"/>
   </w:num>
   <w:num w:numId="6" w16cid:durableId="770318536">
+    <w:abstractNumId w:val="6"/>
+  </w:num>
+  <w:num w:numId="7" w16cid:durableId="527791062">
     <w:abstractNumId w:val="5"/>
   </w:num>
-  <w:num w:numId="7" w16cid:durableId="527791062">
-    <w:abstractNumId w:val="4"/>
-  </w:num>
   <w:num w:numId="8" w16cid:durableId="1127239723">
-    <w:abstractNumId w:val="10"/>
+    <w:abstractNumId w:val="11"/>
   </w:num>
   <w:num w:numId="9" w16cid:durableId="175967512">
+    <w:abstractNumId w:val="8"/>
+  </w:num>
+  <w:num w:numId="10" w16cid:durableId="569081324">
     <w:abstractNumId w:val="7"/>
   </w:num>
-  <w:num w:numId="10" w16cid:durableId="569081324">
-    <w:abstractNumId w:val="6"/>
-  </w:num>
   <w:num w:numId="11" w16cid:durableId="163863947">
-    <w:abstractNumId w:val="12"/>
+    <w:abstractNumId w:val="13"/>
   </w:num>
   <w:num w:numId="12" w16cid:durableId="1439787592">
     <w:abstractNumId w:val="1"/>
   </w:num>
   <w:num w:numId="13" w16cid:durableId="1534728292">
-    <w:abstractNumId w:val="11"/>
+    <w:abstractNumId w:val="12"/>
+  </w:num>
+  <w:num w:numId="14" w16cid:durableId="1725134475">
+    <w:abstractNumId w:val="3"/>
+  </w:num>
+  <w:num w:numId="15" w16cid:durableId="1609924145">
+    <w:abstractNumId w:val="15"/>
+  </w:num>
+  <w:num w:numId="16" w16cid:durableId="1100102058">
+    <w:abstractNumId w:val="14"/>
   </w:num>
 </w:numbering>
 </file>
@@ -12224,4 +12689,16 @@
     </a:ext>
   </a:extLst>
 </a:theme>
+</file>
+
+<file path=customXml/item1.xml><?xml version="1.0" encoding="utf-8"?>
+<b:Sources xmlns:b="http://schemas.openxmlformats.org/officeDocument/2006/bibliography" xmlns="http://schemas.openxmlformats.org/officeDocument/2006/bibliography" SelectedStyle="\APASixthEditionOfficeOnline.xsl" StyleName="APA" Version="6"/>
+</file>
+
+<file path=customXml/itemProps1.xml><?xml version="1.0" encoding="utf-8"?>
+<ds:datastoreItem xmlns:ds="http://schemas.openxmlformats.org/officeDocument/2006/customXml" ds:itemID="{A76784C1-048E-4BDE-8F6A-B1E6712AE349}">
+  <ds:schemaRefs>
+    <ds:schemaRef ds:uri="http://schemas.openxmlformats.org/officeDocument/2006/bibliography"/>
+  </ds:schemaRefs>
+</ds:datastoreItem>
 </file>
</xml_diff>

<commit_message>
sklonjena recenica iz sadrzaja
Change-Id: Id39a2f9635208726d7ac477582b09861b9d9b775
</commit_message>
<xml_diff>
--- a/SSU/Log_in.docx
+++ b/SSU/Log_in.docx
@@ -1444,77 +1444,6 @@
                 <w:webHidden/>
               </w:rPr>
               <w:instrText xml:space="preserve"> PAGEREF _Toc205809931 \h </w:instrText>
-            </w:r>
-            <w:r>
-              <w:rPr>
-                <w:noProof/>
-                <w:webHidden/>
-              </w:rPr>
-            </w:r>
-            <w:r>
-              <w:rPr>
-                <w:noProof/>
-                <w:webHidden/>
-              </w:rPr>
-              <w:fldChar w:fldCharType="separate"/>
-            </w:r>
-            <w:r>
-              <w:rPr>
-                <w:noProof/>
-                <w:webHidden/>
-              </w:rPr>
-              <w:t>4</w:t>
-            </w:r>
-            <w:r>
-              <w:rPr>
-                <w:noProof/>
-                <w:webHidden/>
-              </w:rPr>
-              <w:fldChar w:fldCharType="end"/>
-            </w:r>
-          </w:hyperlink>
-        </w:p>
-        <w:p>
-          <w:pPr>
-            <w:pStyle w:val="TOC2"/>
-            <w:tabs>
-              <w:tab w:val="right" w:pos="9894"/>
-            </w:tabs>
-            <w:rPr>
-              <w:rFonts w:asciiTheme="minorHAnsi" w:eastAsiaTheme="minorEastAsia" w:hAnsiTheme="minorHAnsi" w:cstheme="minorBidi"/>
-              <w:noProof/>
-              <w:color w:val="auto"/>
-              <w:sz w:val="24"/>
-            </w:rPr>
-          </w:pPr>
-          <w:hyperlink w:anchor="_Toc205809932" w:history="1">
-            <w:r>
-              <w:rPr>
-                <w:rStyle w:val="Hyperlink"/>
-                <w:noProof/>
-              </w:rPr>
-              <w:t>Dokument će koristiti svi članovi projektnog tima u razvoju i testiranju funkcionalnosti prijave, a može se koristiti i pri pisanju uputstva za korisnike.</w:t>
-            </w:r>
-            <w:r>
-              <w:rPr>
-                <w:noProof/>
-                <w:webHidden/>
-              </w:rPr>
-              <w:tab/>
-            </w:r>
-            <w:r>
-              <w:rPr>
-                <w:noProof/>
-                <w:webHidden/>
-              </w:rPr>
-              <w:fldChar w:fldCharType="begin"/>
-            </w:r>
-            <w:r>
-              <w:rPr>
-                <w:noProof/>
-                <w:webHidden/>
-              </w:rPr>
-              <w:instrText xml:space="preserve"> PAGEREF _Toc205809932 \h </w:instrText>
             </w:r>
             <w:r>
               <w:rPr>

</xml_diff>